<commit_message>
Diagrama del modelo relacional y documento de entrega mas corto
Se agrega el diagrama de las 10 tablas con sus llaves y las flechas de
llave foranea (SVG y PNG). El documento Word queda con los dos
diagramas y el esquema de las tablas, sin los pasos ni el anexo SQL.
</commit_message>
<xml_diff>
--- a/database/Modelo_Relacional_TicketFlow.docx
+++ b/database/Modelo_Relacional_TicketFlow.docx
@@ -6,6 +6,36 @@
     <w:p/>
     <w:p/>
     <w:p/>
+    <w:p/>
+    <w:p>
+      <w:pPr>
+        <w:spacing w:after="120"/>
+        <w:jc w:val="center"/>
+      </w:pPr>
+      <w:r>
+        <w:rPr>
+          <w:b/>
+          <w:i w:val="0"/>
+          <w:sz w:val="48"/>
+        </w:rPr>
+        <w:t>Modelo relacional de TicketFlow</w:t>
+      </w:r>
+    </w:p>
+    <w:p>
+      <w:pPr>
+        <w:spacing w:after="680"/>
+        <w:jc w:val="center"/>
+      </w:pPr>
+      <w:r>
+        <w:rPr>
+          <w:b w:val="0"/>
+          <w:i w:val="0"/>
+          <w:color w:val="5A5868"/>
+          <w:sz w:val="26"/>
+        </w:rPr>
+        <w:t>Del diagrama entidad-relación a las tablas</w:t>
+      </w:r>
+    </w:p>
     <w:p>
       <w:pPr>
         <w:spacing w:after="40"/>
@@ -13,31 +43,16 @@
       </w:pPr>
       <w:r>
         <w:rPr>
-          <w:b/>
+          <w:b w:val="0"/>
           <w:i w:val="0"/>
-          <w:color w:val="493EE5"/>
-          <w:sz w:val="56"/>
+          <w:sz w:val="23"/>
         </w:rPr>
-        <w:t>TICKETFLOW</w:t>
+        <w:t>Bases de Datos y Programación en Ambiente Web I</w:t>
       </w:r>
     </w:p>
     <w:p>
       <w:pPr>
-        <w:spacing w:after="80"/>
-        <w:jc w:val="center"/>
-      </w:pPr>
-      <w:r>
-        <w:rPr>
-          <w:b/>
-          <w:i w:val="0"/>
-          <w:sz w:val="32"/>
-        </w:rPr>
-        <w:t>Del Modelo Entidad-Relación al Modelo Relacional</w:t>
-      </w:r>
-    </w:p>
-    <w:p>
-      <w:pPr>
-        <w:spacing w:after="560"/>
+        <w:spacing w:after="520"/>
         <w:jc w:val="center"/>
       </w:pPr>
       <w:r>
@@ -45,24 +60,9 @@
           <w:b w:val="0"/>
           <w:i w:val="0"/>
           <w:color w:val="5A5868"/>
-          <w:sz w:val="24"/>
+          <w:sz w:val="23"/>
         </w:rPr>
-        <w:t>Transformación paso a paso del diagrama E-R del proyecto</w:t>
-      </w:r>
-    </w:p>
-    <w:p>
-      <w:pPr>
-        <w:spacing w:after="480"/>
-        <w:jc w:val="center"/>
-      </w:pPr>
-      <w:r>
-        <w:rPr>
-          <w:b w:val="0"/>
-          <w:i w:val="0"/>
-          <w:color w:val="5A5868"/>
-          <w:sz w:val="21"/>
-        </w:rPr>
-        <w:t>Bases de Datos y Programación en Ambiente Web I · Proyecto Integrador 2026-2</w:t>
+        <w:t>Proyecto Integrador 2026-2</w:t>
       </w:r>
     </w:p>
     <w:p>
@@ -123,7 +123,7 @@
     </w:p>
     <w:p>
       <w:pPr>
-        <w:spacing w:before="560" w:after="40"/>
+        <w:spacing w:before="520" w:after="40"/>
         <w:jc w:val="center"/>
       </w:pPr>
       <w:r>
@@ -132,7 +132,7 @@
           <w:i w:val="0"/>
           <w:sz w:val="22"/>
         </w:rPr>
-        <w:t>Unidad Central del Valle del Cauca — UCEVA · Tuluá</w:t>
+        <w:t>Unidad Central del Valle del Cauca</w:t>
       </w:r>
     </w:p>
     <w:p>
@@ -146,7 +146,7 @@
           <w:color w:val="5A5868"/>
           <w:sz w:val="22"/>
         </w:rPr>
-        <w:t>Septiembre de 2026</w:t>
+        <w:t>Tuluá · Septiembre de 2026</w:t>
       </w:r>
     </w:p>
     <w:p>
@@ -159,7 +159,7 @@
         <w:pStyle w:val="Heading1"/>
       </w:pPr>
       <w:r>
-        <w:t>1. Punto de partida: el diagrama Entidad-Relación</w:t>
+        <w:t>1. Lo que hicimos</w:t>
       </w:r>
     </w:p>
     <w:p>
@@ -168,7 +168,51 @@
           <w:b w:val="0"/>
           <w:i w:val="0"/>
         </w:rPr>
-        <w:t>El siguiente diagrama, en notación de Chen, es el modelo conceptual del proyecto. De él salen las diez relaciones (tablas) del modelo relacional.</w:t>
+        <w:t>Para esta entrega pasamos el diagrama entidad-relación de nuestro proyecto al modelo relacional, siguiendo los pasos que vimos en clase.</w:t>
+      </w:r>
+    </w:p>
+    <w:p>
+      <w:r>
+        <w:rPr>
+          <w:b w:val="0"/>
+          <w:i w:val="0"/>
+        </w:rPr>
+        <w:t>Primero hicimos el diagrama entidad-relación con los datos del enunciado. Ahí quedaron diez entidades y once relaciones. Después lo convertimos en tablas. Cada entidad se volvió una tabla, y cada relación de uno a muchos se volvió una llave foránea en la tabla del lado de los muchos.</w:t>
+      </w:r>
+    </w:p>
+    <w:p>
+      <w:r>
+        <w:rPr>
+          <w:b w:val="0"/>
+          <w:i w:val="0"/>
+        </w:rPr>
+        <w:t>El teléfono fue el único caso distinto, porque una persona puede tener varios. Por eso quedó en su propia tabla, con una llave primaria formada por la identificación de la persona y el número.</w:t>
+      </w:r>
+    </w:p>
+    <w:p>
+      <w:r>
+        <w:rPr>
+          <w:b w:val="0"/>
+          <w:i w:val="0"/>
+        </w:rPr>
+        <w:t>También separamos cliente, agente y administrador en tres tablas aparte. Las tres usan la misma identificación de la persona, que es su llave primaria y al mismo tiempo una llave foránea hacia la tabla persona. Lo hicimos así porque el enunciado pide poder registrar, modificar, eliminar y consultar cada uno por separado.</w:t>
+      </w:r>
+    </w:p>
+    <w:p>
+      <w:pPr>
+        <w:pStyle w:val="Heading1"/>
+      </w:pPr>
+      <w:r>
+        <w:t>2. Diagrama entidad-relación</w:t>
+      </w:r>
+    </w:p>
+    <w:p>
+      <w:r>
+        <w:rPr>
+          <w:b w:val="0"/>
+          <w:i w:val="0"/>
+        </w:rPr>
+        <w:t>Este es el diagrama del que partimos. Está en notación de Chen: los rectángulos son las entidades, los rombos son las relaciones y las elipses son los atributos. El rectángulo doble es la entidad débil, o sea teléfono.</w:t>
       </w:r>
     </w:p>
     <w:p>
@@ -178,7 +222,7 @@
       <w:r>
         <w:drawing>
           <wp:inline xmlns:a="http://schemas.openxmlformats.org/drawingml/2006/main" xmlns:pic="http://schemas.openxmlformats.org/drawingml/2006/picture">
-            <wp:extent cx="5903999" cy="3485493"/>
+            <wp:extent cx="5832000" cy="3442988"/>
             <wp:docPr id="1" name="Picture 1"/>
             <wp:cNvGraphicFramePr>
               <a:graphicFrameLocks noChangeAspect="1"/>
@@ -199,7 +243,7 @@
                   <pic:spPr>
                     <a:xfrm>
                       <a:off x="0" y="0"/>
-                      <a:ext cx="5903999" cy="3485493"/>
+                      <a:ext cx="5832000" cy="3442988"/>
                     </a:xfrm>
                     <a:prstGeom prst="rect"/>
                   </pic:spPr>
@@ -212,7 +256,7 @@
     </w:p>
     <w:p>
       <w:pPr>
-        <w:spacing w:after="200"/>
+        <w:spacing w:before="60" w:after="240"/>
         <w:jc w:val="center"/>
       </w:pPr>
       <w:r>
@@ -220,77 +264,9 @@
           <w:b w:val="0"/>
           <w:i/>
           <w:color w:val="5A5868"/>
-          <w:sz w:val="18"/>
+          <w:sz w:val="19"/>
         </w:rPr>
-        <w:t>Figura 1. Diagrama Entidad-Relación de TicketFlow (notación de Chen).</w:t>
-      </w:r>
-    </w:p>
-    <w:p>
-      <w:pPr>
-        <w:pStyle w:val="Heading2"/>
-      </w:pPr>
-      <w:r>
-        <w:t>Notación que se usa en este documento</w:t>
-      </w:r>
-    </w:p>
-    <w:p>
-      <w:pPr>
-        <w:pStyle w:val="ListBullet"/>
-        <w:spacing w:after="60"/>
-      </w:pPr>
-      <w:r>
-        <w:rPr>
-          <w:b/>
-        </w:rPr>
-        <w:t xml:space="preserve">Esquema: </w:t>
-      </w:r>
-      <w:r>
-        <w:t>cada relación se escribe como NOMBRE (atributo1, atributo2, …).</w:t>
-      </w:r>
-    </w:p>
-    <w:p>
-      <w:pPr>
-        <w:pStyle w:val="ListBullet"/>
-        <w:spacing w:after="60"/>
-      </w:pPr>
-      <w:r>
-        <w:rPr>
-          <w:b/>
-        </w:rPr>
-        <w:t xml:space="preserve">Llave primaria (PK): </w:t>
-      </w:r>
-      <w:r>
-        <w:t>va subrayada y en negrita.</w:t>
-      </w:r>
-    </w:p>
-    <w:p>
-      <w:pPr>
-        <w:pStyle w:val="ListBullet"/>
-        <w:spacing w:after="60"/>
-      </w:pPr>
-      <w:r>
-        <w:rPr>
-          <w:b/>
-        </w:rPr>
-        <w:t xml:space="preserve">Llave foránea (FK): </w:t>
-      </w:r>
-      <w:r>
-        <w:t>va en azul y marcada con un asterisco (*). Debajo de cada relación se indica a qué tabla apunta.</w:t>
-      </w:r>
-    </w:p>
-    <w:p>
-      <w:pPr>
-        <w:pStyle w:val="ListBullet"/>
-        <w:spacing w:after="60"/>
-      </w:pPr>
-      <w:r>
-        <w:rPr>
-          <w:b/>
-        </w:rPr>
-        <w:t xml:space="preserve">PK que también es FK: </w:t>
-      </w:r>
-      <w:r>
-        <w:t>una llave que además es foránea aparece subrayada y en azul.</w:t>
+        <w:t>Figura 1. Diagrama entidad-relación de TicketFlow.</w:t>
       </w:r>
     </w:p>
     <w:p>
@@ -303,15 +279,7 @@
         <w:pStyle w:val="Heading1"/>
       </w:pPr>
       <w:r>
-        <w:t>2. Transformación paso a paso</w:t>
-      </w:r>
-    </w:p>
-    <w:p>
-      <w:pPr>
-        <w:pStyle w:val="Heading2"/>
-      </w:pPr>
-      <w:r>
-        <w:t>Paso 1 · Entidades fuertes</w:t>
+        <w:t>3. Diagrama relacional</w:t>
       </w:r>
     </w:p>
     <w:p>
@@ -320,7 +288,74 @@
           <w:b w:val="0"/>
           <w:i w:val="0"/>
         </w:rPr>
-        <w:t>Regla: por cada entidad fuerte se crea una relación con una columna por cada atributo simple, y el atributo identificador pasa a ser la llave primaria.</w:t>
+        <w:t>Este es el resultado después de convertirlo. Quedaron diez tablas. En cada una se ve la llave primaria subrayada y las llaves foráneas marcadas con FK. Las flechas van desde la llave foránea hasta la tabla a la que apunta.</w:t>
+      </w:r>
+    </w:p>
+    <w:p>
+      <w:pPr>
+        <w:jc w:val="center"/>
+      </w:pPr>
+      <w:r>
+        <w:drawing>
+          <wp:inline xmlns:a="http://schemas.openxmlformats.org/drawingml/2006/main" xmlns:pic="http://schemas.openxmlformats.org/drawingml/2006/picture">
+            <wp:extent cx="5832000" cy="3424294"/>
+            <wp:docPr id="2" name="Picture 2"/>
+            <wp:cNvGraphicFramePr>
+              <a:graphicFrameLocks noChangeAspect="1"/>
+            </wp:cNvGraphicFramePr>
+            <a:graphic>
+              <a:graphicData uri="http://schemas.openxmlformats.org/drawingml/2006/picture">
+                <pic:pic>
+                  <pic:nvPicPr>
+                    <pic:cNvPr id="0" name="Diagrama_Relacional_TicketFlow.png"/>
+                    <pic:cNvPicPr/>
+                  </pic:nvPicPr>
+                  <pic:blipFill>
+                    <a:blip r:embed="rId10"/>
+                    <a:stretch>
+                      <a:fillRect/>
+                    </a:stretch>
+                  </pic:blipFill>
+                  <pic:spPr>
+                    <a:xfrm>
+                      <a:off x="0" y="0"/>
+                      <a:ext cx="5832000" cy="3424294"/>
+                    </a:xfrm>
+                    <a:prstGeom prst="rect"/>
+                  </pic:spPr>
+                </pic:pic>
+              </a:graphicData>
+            </a:graphic>
+          </wp:inline>
+        </w:drawing>
+      </w:r>
+    </w:p>
+    <w:p>
+      <w:pPr>
+        <w:spacing w:before="60" w:after="240"/>
+        <w:jc w:val="center"/>
+      </w:pPr>
+      <w:r>
+        <w:rPr>
+          <w:b w:val="0"/>
+          <w:i/>
+          <w:color w:val="5A5868"/>
+          <w:sz w:val="19"/>
+        </w:rPr>
+        <w:t>Figura 2. Modelo relacional de TicketFlow.</w:t>
+      </w:r>
+    </w:p>
+    <w:p>
+      <w:r>
+        <w:br w:type="page"/>
+      </w:r>
+    </w:p>
+    <w:p>
+      <w:pPr>
+        <w:pStyle w:val="Heading1"/>
+      </w:pPr>
+      <w:r>
+        <w:t>4. Las tablas</w:t>
       </w:r>
     </w:p>
     <w:p>
@@ -329,13 +364,13 @@
           <w:b w:val="0"/>
           <w:i w:val="0"/>
         </w:rPr>
-        <w:t>En nuestro diagrama son fuertes PAIS, DEPARTAMENTO, CIUDAD, PERSONA, EVENTO y RESERVA. El atributo compuesto nombre_completo se descompone en sus partes simples (nombres y apellidos), como indica el paso 2 del documento de transformación.</w:t>
+        <w:t>Escribimos las tablas también en texto, para que se vea mejor cuál es la llave primaria de cada una. La llave primaria va subrayada y las llaves foráneas van en azul con un asterisco.</w:t>
       </w:r>
     </w:p>
     <w:p>
       <w:pPr>
-        <w:spacing w:after="40"/>
-        <w:ind w:left="340"/>
+        <w:spacing w:after="80"/>
+        <w:ind w:left="283"/>
       </w:pPr>
       <w:r>
         <w:rPr>
@@ -347,7 +382,7 @@
       </w:r>
       <w:r>
         <w:rPr>
-          <w:rFonts w:ascii="Consolas" w:hAnsi="Consolas"/>
+          <w:rFonts w:ascii="Consolas" w:hAnsi="Consolas" w:eastAsia="Consolas"/>
           <w:sz w:val="21"/>
         </w:rPr>
         <w:t xml:space="preserve"> (</w:t>
@@ -363,7 +398,7 @@
       </w:r>
       <w:r>
         <w:rPr>
-          <w:rFonts w:ascii="Consolas" w:hAnsi="Consolas"/>
+          <w:rFonts w:ascii="Consolas" w:hAnsi="Consolas" w:eastAsia="Consolas"/>
           <w:sz w:val="21"/>
         </w:rPr>
         <w:t xml:space="preserve">, </w:t>
@@ -377,7 +412,7 @@
       </w:r>
       <w:r>
         <w:rPr>
-          <w:rFonts w:ascii="Consolas" w:hAnsi="Consolas"/>
+          <w:rFonts w:ascii="Consolas" w:hAnsi="Consolas" w:eastAsia="Consolas"/>
           <w:sz w:val="21"/>
         </w:rPr>
         <w:t>)</w:t>
@@ -385,8 +420,8 @@
     </w:p>
     <w:p>
       <w:pPr>
-        <w:spacing w:after="40"/>
-        <w:ind w:left="340"/>
+        <w:spacing w:after="80"/>
+        <w:ind w:left="283"/>
       </w:pPr>
       <w:r>
         <w:rPr>
@@ -398,7 +433,7 @@
       </w:r>
       <w:r>
         <w:rPr>
-          <w:rFonts w:ascii="Consolas" w:hAnsi="Consolas"/>
+          <w:rFonts w:ascii="Consolas" w:hAnsi="Consolas" w:eastAsia="Consolas"/>
           <w:sz w:val="21"/>
         </w:rPr>
         <w:t xml:space="preserve"> (</w:t>
@@ -414,7 +449,7 @@
       </w:r>
       <w:r>
         <w:rPr>
-          <w:rFonts w:ascii="Consolas" w:hAnsi="Consolas"/>
+          <w:rFonts w:ascii="Consolas" w:hAnsi="Consolas" w:eastAsia="Consolas"/>
           <w:sz w:val="21"/>
         </w:rPr>
         <w:t xml:space="preserve">, </w:t>
@@ -428,7 +463,30 @@
       </w:r>
       <w:r>
         <w:rPr>
-          <w:rFonts w:ascii="Consolas" w:hAnsi="Consolas"/>
+          <w:rFonts w:ascii="Consolas" w:hAnsi="Consolas" w:eastAsia="Consolas"/>
+          <w:sz w:val="21"/>
+        </w:rPr>
+        <w:t xml:space="preserve">, </w:t>
+      </w:r>
+      <w:r>
+        <w:rPr>
+          <w:rFonts w:ascii="Consolas" w:hAnsi="Consolas" w:eastAsia="Consolas"/>
+          <w:color w:val="493EE5"/>
+          <w:sz w:val="21"/>
+        </w:rPr>
+        <w:t>id_pais</w:t>
+      </w:r>
+      <w:r>
+        <w:rPr>
+          <w:rFonts w:ascii="Consolas" w:hAnsi="Consolas" w:eastAsia="Consolas"/>
+          <w:color w:val="493EE5"/>
+          <w:sz w:val="21"/>
+        </w:rPr>
+        <w:t>*</w:t>
+      </w:r>
+      <w:r>
+        <w:rPr>
+          <w:rFonts w:ascii="Consolas" w:hAnsi="Consolas" w:eastAsia="Consolas"/>
           <w:sz w:val="21"/>
         </w:rPr>
         <w:t>)</w:t>
@@ -436,8 +494,8 @@
     </w:p>
     <w:p>
       <w:pPr>
-        <w:spacing w:after="40"/>
-        <w:ind w:left="340"/>
+        <w:spacing w:after="80"/>
+        <w:ind w:left="283"/>
       </w:pPr>
       <w:r>
         <w:rPr>
@@ -449,7 +507,7 @@
       </w:r>
       <w:r>
         <w:rPr>
-          <w:rFonts w:ascii="Consolas" w:hAnsi="Consolas"/>
+          <w:rFonts w:ascii="Consolas" w:hAnsi="Consolas" w:eastAsia="Consolas"/>
           <w:sz w:val="21"/>
         </w:rPr>
         <w:t xml:space="preserve"> (</w:t>
@@ -465,7 +523,7 @@
       </w:r>
       <w:r>
         <w:rPr>
-          <w:rFonts w:ascii="Consolas" w:hAnsi="Consolas"/>
+          <w:rFonts w:ascii="Consolas" w:hAnsi="Consolas" w:eastAsia="Consolas"/>
           <w:sz w:val="21"/>
         </w:rPr>
         <w:t xml:space="preserve">, </w:t>
@@ -479,7 +537,30 @@
       </w:r>
       <w:r>
         <w:rPr>
-          <w:rFonts w:ascii="Consolas" w:hAnsi="Consolas"/>
+          <w:rFonts w:ascii="Consolas" w:hAnsi="Consolas" w:eastAsia="Consolas"/>
+          <w:sz w:val="21"/>
+        </w:rPr>
+        <w:t xml:space="preserve">, </w:t>
+      </w:r>
+      <w:r>
+        <w:rPr>
+          <w:rFonts w:ascii="Consolas" w:hAnsi="Consolas" w:eastAsia="Consolas"/>
+          <w:color w:val="493EE5"/>
+          <w:sz w:val="21"/>
+        </w:rPr>
+        <w:t>id_departamento</w:t>
+      </w:r>
+      <w:r>
+        <w:rPr>
+          <w:rFonts w:ascii="Consolas" w:hAnsi="Consolas" w:eastAsia="Consolas"/>
+          <w:color w:val="493EE5"/>
+          <w:sz w:val="21"/>
+        </w:rPr>
+        <w:t>*</w:t>
+      </w:r>
+      <w:r>
+        <w:rPr>
+          <w:rFonts w:ascii="Consolas" w:hAnsi="Consolas" w:eastAsia="Consolas"/>
           <w:sz w:val="21"/>
         </w:rPr>
         <w:t>)</w:t>
@@ -487,8 +568,8 @@
     </w:p>
     <w:p>
       <w:pPr>
-        <w:spacing w:after="40"/>
-        <w:ind w:left="340"/>
+        <w:spacing w:after="80"/>
+        <w:ind w:left="283"/>
       </w:pPr>
       <w:r>
         <w:rPr>
@@ -500,7 +581,7 @@
       </w:r>
       <w:r>
         <w:rPr>
-          <w:rFonts w:ascii="Consolas" w:hAnsi="Consolas"/>
+          <w:rFonts w:ascii="Consolas" w:hAnsi="Consolas" w:eastAsia="Consolas"/>
           <w:sz w:val="21"/>
         </w:rPr>
         <w:t xml:space="preserve"> (</w:t>
@@ -516,7 +597,7 @@
       </w:r>
       <w:r>
         <w:rPr>
-          <w:rFonts w:ascii="Consolas" w:hAnsi="Consolas"/>
+          <w:rFonts w:ascii="Consolas" w:hAnsi="Consolas" w:eastAsia="Consolas"/>
           <w:sz w:val="21"/>
         </w:rPr>
         <w:t xml:space="preserve">, </w:t>
@@ -530,7 +611,7 @@
       </w:r>
       <w:r>
         <w:rPr>
-          <w:rFonts w:ascii="Consolas" w:hAnsi="Consolas"/>
+          <w:rFonts w:ascii="Consolas" w:hAnsi="Consolas" w:eastAsia="Consolas"/>
           <w:sz w:val="21"/>
         </w:rPr>
         <w:t xml:space="preserve">, </w:t>
@@ -544,7 +625,7 @@
       </w:r>
       <w:r>
         <w:rPr>
-          <w:rFonts w:ascii="Consolas" w:hAnsi="Consolas"/>
+          <w:rFonts w:ascii="Consolas" w:hAnsi="Consolas" w:eastAsia="Consolas"/>
           <w:sz w:val="21"/>
         </w:rPr>
         <w:t xml:space="preserve">, </w:t>
@@ -558,7 +639,7 @@
       </w:r>
       <w:r>
         <w:rPr>
-          <w:rFonts w:ascii="Consolas" w:hAnsi="Consolas"/>
+          <w:rFonts w:ascii="Consolas" w:hAnsi="Consolas" w:eastAsia="Consolas"/>
           <w:sz w:val="21"/>
         </w:rPr>
         <w:t xml:space="preserve">, </w:t>
@@ -572,7 +653,30 @@
       </w:r>
       <w:r>
         <w:rPr>
-          <w:rFonts w:ascii="Consolas" w:hAnsi="Consolas"/>
+          <w:rFonts w:ascii="Consolas" w:hAnsi="Consolas" w:eastAsia="Consolas"/>
+          <w:sz w:val="21"/>
+        </w:rPr>
+        <w:t xml:space="preserve">, </w:t>
+      </w:r>
+      <w:r>
+        <w:rPr>
+          <w:rFonts w:ascii="Consolas" w:hAnsi="Consolas" w:eastAsia="Consolas"/>
+          <w:color w:val="493EE5"/>
+          <w:sz w:val="21"/>
+        </w:rPr>
+        <w:t>id_ciudad</w:t>
+      </w:r>
+      <w:r>
+        <w:rPr>
+          <w:rFonts w:ascii="Consolas" w:hAnsi="Consolas" w:eastAsia="Consolas"/>
+          <w:color w:val="493EE5"/>
+          <w:sz w:val="21"/>
+        </w:rPr>
+        <w:t>*</w:t>
+      </w:r>
+      <w:r>
+        <w:rPr>
+          <w:rFonts w:ascii="Consolas" w:hAnsi="Consolas" w:eastAsia="Consolas"/>
           <w:sz w:val="21"/>
         </w:rPr>
         <w:t>)</w:t>
@@ -580,301 +684,8 @@
     </w:p>
     <w:p>
       <w:pPr>
-        <w:spacing w:after="40"/>
-        <w:ind w:left="340"/>
-      </w:pPr>
-      <w:r>
-        <w:rPr>
-          <w:rFonts w:ascii="Consolas" w:hAnsi="Consolas" w:eastAsia="Consolas"/>
-          <w:b/>
-          <w:sz w:val="21"/>
-        </w:rPr>
-        <w:t>EVENTO</w:t>
-      </w:r>
-      <w:r>
-        <w:rPr>
-          <w:rFonts w:ascii="Consolas" w:hAnsi="Consolas"/>
-          <w:sz w:val="21"/>
-        </w:rPr>
-        <w:t xml:space="preserve"> (</w:t>
-      </w:r>
-      <w:r>
-        <w:rPr>
-          <w:rFonts w:ascii="Consolas" w:hAnsi="Consolas" w:eastAsia="Consolas"/>
-          <w:b/>
-          <w:sz w:val="21"/>
-          <w:u w:val="single"/>
-        </w:rPr>
-        <w:t>codigo_evento</w:t>
-      </w:r>
-      <w:r>
-        <w:rPr>
-          <w:rFonts w:ascii="Consolas" w:hAnsi="Consolas"/>
-          <w:sz w:val="21"/>
-        </w:rPr>
-        <w:t xml:space="preserve">, </w:t>
-      </w:r>
-      <w:r>
-        <w:rPr>
-          <w:rFonts w:ascii="Consolas" w:hAnsi="Consolas" w:eastAsia="Consolas"/>
-          <w:sz w:val="21"/>
-        </w:rPr>
-        <w:t>nombre</w:t>
-      </w:r>
-      <w:r>
-        <w:rPr>
-          <w:rFonts w:ascii="Consolas" w:hAnsi="Consolas"/>
-          <w:sz w:val="21"/>
-        </w:rPr>
-        <w:t xml:space="preserve">, </w:t>
-      </w:r>
-      <w:r>
-        <w:rPr>
-          <w:rFonts w:ascii="Consolas" w:hAnsi="Consolas" w:eastAsia="Consolas"/>
-          <w:sz w:val="21"/>
-        </w:rPr>
-        <w:t>descripcion</w:t>
-      </w:r>
-      <w:r>
-        <w:rPr>
-          <w:rFonts w:ascii="Consolas" w:hAnsi="Consolas"/>
-          <w:sz w:val="21"/>
-        </w:rPr>
-        <w:t xml:space="preserve">, </w:t>
-      </w:r>
-      <w:r>
-        <w:rPr>
-          <w:rFonts w:ascii="Consolas" w:hAnsi="Consolas" w:eastAsia="Consolas"/>
-          <w:sz w:val="21"/>
-        </w:rPr>
-        <w:t>teatro</w:t>
-      </w:r>
-      <w:r>
-        <w:rPr>
-          <w:rFonts w:ascii="Consolas" w:hAnsi="Consolas"/>
-          <w:sz w:val="21"/>
-        </w:rPr>
-        <w:t xml:space="preserve">, </w:t>
-      </w:r>
-      <w:r>
-        <w:rPr>
-          <w:rFonts w:ascii="Consolas" w:hAnsi="Consolas" w:eastAsia="Consolas"/>
-          <w:sz w:val="21"/>
-        </w:rPr>
-        <w:t>fecha_hora_inicio</w:t>
-      </w:r>
-      <w:r>
-        <w:rPr>
-          <w:rFonts w:ascii="Consolas" w:hAnsi="Consolas"/>
-          <w:sz w:val="21"/>
-        </w:rPr>
-        <w:t xml:space="preserve">, </w:t>
-      </w:r>
-      <w:r>
-        <w:rPr>
-          <w:rFonts w:ascii="Consolas" w:hAnsi="Consolas" w:eastAsia="Consolas"/>
-          <w:sz w:val="21"/>
-        </w:rPr>
-        <w:t>fecha_hora_fin</w:t>
-      </w:r>
-      <w:r>
-        <w:rPr>
-          <w:rFonts w:ascii="Consolas" w:hAnsi="Consolas"/>
-          <w:sz w:val="21"/>
-        </w:rPr>
-        <w:t xml:space="preserve">, </w:t>
-      </w:r>
-      <w:r>
-        <w:rPr>
-          <w:rFonts w:ascii="Consolas" w:hAnsi="Consolas" w:eastAsia="Consolas"/>
-          <w:sz w:val="21"/>
-        </w:rPr>
-        <w:t>capacidad_total</w:t>
-      </w:r>
-      <w:r>
-        <w:rPr>
-          <w:rFonts w:ascii="Consolas" w:hAnsi="Consolas"/>
-          <w:sz w:val="21"/>
-        </w:rPr>
-        <w:t xml:space="preserve">, </w:t>
-      </w:r>
-      <w:r>
-        <w:rPr>
-          <w:rFonts w:ascii="Consolas" w:hAnsi="Consolas" w:eastAsia="Consolas"/>
-          <w:sz w:val="21"/>
-        </w:rPr>
-        <w:t>precio_base</w:t>
-      </w:r>
-      <w:r>
-        <w:rPr>
-          <w:rFonts w:ascii="Consolas" w:hAnsi="Consolas"/>
-          <w:sz w:val="21"/>
-        </w:rPr>
-        <w:t xml:space="preserve">, </w:t>
-      </w:r>
-      <w:r>
-        <w:rPr>
-          <w:rFonts w:ascii="Consolas" w:hAnsi="Consolas" w:eastAsia="Consolas"/>
-          <w:sz w:val="21"/>
-        </w:rPr>
-        <w:t>observaciones</w:t>
-      </w:r>
-      <w:r>
-        <w:rPr>
-          <w:rFonts w:ascii="Consolas" w:hAnsi="Consolas"/>
-          <w:sz w:val="21"/>
-        </w:rPr>
-        <w:t xml:space="preserve">, </w:t>
-      </w:r>
-      <w:r>
-        <w:rPr>
-          <w:rFonts w:ascii="Consolas" w:hAnsi="Consolas" w:eastAsia="Consolas"/>
-          <w:sz w:val="21"/>
-        </w:rPr>
-        <w:t>estado</w:t>
-      </w:r>
-      <w:r>
-        <w:rPr>
-          <w:rFonts w:ascii="Consolas" w:hAnsi="Consolas"/>
-          <w:sz w:val="21"/>
-        </w:rPr>
-        <w:t>)</w:t>
-      </w:r>
-    </w:p>
-    <w:p>
-      <w:pPr>
-        <w:spacing w:after="40"/>
-        <w:ind w:left="340"/>
-      </w:pPr>
-      <w:r>
-        <w:rPr>
-          <w:rFonts w:ascii="Consolas" w:hAnsi="Consolas" w:eastAsia="Consolas"/>
-          <w:b/>
-          <w:sz w:val="21"/>
-        </w:rPr>
-        <w:t>RESERVA</w:t>
-      </w:r>
-      <w:r>
-        <w:rPr>
-          <w:rFonts w:ascii="Consolas" w:hAnsi="Consolas"/>
-          <w:sz w:val="21"/>
-        </w:rPr>
-        <w:t xml:space="preserve"> (</w:t>
-      </w:r>
-      <w:r>
-        <w:rPr>
-          <w:rFonts w:ascii="Consolas" w:hAnsi="Consolas" w:eastAsia="Consolas"/>
-          <w:b/>
-          <w:sz w:val="21"/>
-          <w:u w:val="single"/>
-        </w:rPr>
-        <w:t>id_reserva</w:t>
-      </w:r>
-      <w:r>
-        <w:rPr>
-          <w:rFonts w:ascii="Consolas" w:hAnsi="Consolas"/>
-          <w:sz w:val="21"/>
-        </w:rPr>
-        <w:t xml:space="preserve">, </w:t>
-      </w:r>
-      <w:r>
-        <w:rPr>
-          <w:rFonts w:ascii="Consolas" w:hAnsi="Consolas" w:eastAsia="Consolas"/>
-          <w:sz w:val="21"/>
-        </w:rPr>
-        <w:t>fecha_hora</w:t>
-      </w:r>
-      <w:r>
-        <w:rPr>
-          <w:rFonts w:ascii="Consolas" w:hAnsi="Consolas"/>
-          <w:sz w:val="21"/>
-        </w:rPr>
-        <w:t xml:space="preserve">, </w:t>
-      </w:r>
-      <w:r>
-        <w:rPr>
-          <w:rFonts w:ascii="Consolas" w:hAnsi="Consolas" w:eastAsia="Consolas"/>
-          <w:sz w:val="21"/>
-        </w:rPr>
-        <w:t>numero_entradas</w:t>
-      </w:r>
-      <w:r>
-        <w:rPr>
-          <w:rFonts w:ascii="Consolas" w:hAnsi="Consolas"/>
-          <w:sz w:val="21"/>
-        </w:rPr>
-        <w:t xml:space="preserve">, </w:t>
-      </w:r>
-      <w:r>
-        <w:rPr>
-          <w:rFonts w:ascii="Consolas" w:hAnsi="Consolas" w:eastAsia="Consolas"/>
-          <w:sz w:val="21"/>
-        </w:rPr>
-        <w:t>observaciones</w:t>
-      </w:r>
-      <w:r>
-        <w:rPr>
-          <w:rFonts w:ascii="Consolas" w:hAnsi="Consolas"/>
-          <w:sz w:val="21"/>
-        </w:rPr>
-        <w:t xml:space="preserve">, </w:t>
-      </w:r>
-      <w:r>
-        <w:rPr>
-          <w:rFonts w:ascii="Consolas" w:hAnsi="Consolas" w:eastAsia="Consolas"/>
-          <w:sz w:val="21"/>
-        </w:rPr>
-        <w:t>estado</w:t>
-      </w:r>
-      <w:r>
-        <w:rPr>
-          <w:rFonts w:ascii="Consolas" w:hAnsi="Consolas"/>
-          <w:sz w:val="21"/>
-        </w:rPr>
-        <w:t>)</w:t>
-      </w:r>
-    </w:p>
-    <w:p>
-      <w:r>
-        <w:rPr>
-          <w:b w:val="0"/>
-          <w:i/>
-          <w:color w:val="5A5868"/>
-          <w:sz w:val="20"/>
-        </w:rPr>
-        <w:t>Los atributos derivados cupos_disponibles y valor_total no se crean como columnas: se calculan cuando se consultan, para que no queden dos datos que puedan contradecirse.</w:t>
-      </w:r>
-    </w:p>
-    <w:p>
-      <w:pPr>
-        <w:pStyle w:val="Heading2"/>
-      </w:pPr>
-      <w:r>
-        <w:t>Paso 2 · Entidad débil</w:t>
-      </w:r>
-    </w:p>
-    <w:p>
-      <w:r>
-        <w:rPr>
-          <w:b w:val="0"/>
-          <w:i w:val="0"/>
-        </w:rPr>
-        <w:t>Regla: la entidad débil se convierte en una relación que incluye como llave foránea la llave primaria de su entidad fuerte. La llave primaria se forma con esa llave foránea más el identificador parcial.</w:t>
-      </w:r>
-    </w:p>
-    <w:p>
-      <w:r>
-        <w:rPr>
-          <w:b w:val="0"/>
-          <w:i w:val="0"/>
-        </w:rPr>
-        <w:t>TELEFONO es débil y depende de PERSONA: un número por sí solo no identifica nada, pero junto con la identificación de su dueño sí.</w:t>
-      </w:r>
-    </w:p>
-    <w:p>
-      <w:pPr>
-        <w:spacing w:after="40"/>
-        <w:ind w:left="340"/>
+        <w:spacing w:after="80"/>
+        <w:ind w:left="283"/>
       </w:pPr>
       <w:r>
         <w:rPr>
@@ -886,7 +697,7 @@
       </w:r>
       <w:r>
         <w:rPr>
-          <w:rFonts w:ascii="Consolas" w:hAnsi="Consolas"/>
+          <w:rFonts w:ascii="Consolas" w:hAnsi="Consolas" w:eastAsia="Consolas"/>
           <w:sz w:val="21"/>
         </w:rPr>
         <w:t xml:space="preserve"> (</w:t>
@@ -903,7 +714,7 @@
       </w:r>
       <w:r>
         <w:rPr>
-          <w:rFonts w:ascii="Consolas" w:hAnsi="Consolas"/>
+          <w:rFonts w:ascii="Consolas" w:hAnsi="Consolas" w:eastAsia="Consolas"/>
           <w:color w:val="493EE5"/>
           <w:sz w:val="21"/>
         </w:rPr>
@@ -911,7 +722,7 @@
       </w:r>
       <w:r>
         <w:rPr>
-          <w:rFonts w:ascii="Consolas" w:hAnsi="Consolas"/>
+          <w:rFonts w:ascii="Consolas" w:hAnsi="Consolas" w:eastAsia="Consolas"/>
           <w:sz w:val="21"/>
         </w:rPr>
         <w:t xml:space="preserve">, </w:t>
@@ -927,7 +738,7 @@
       </w:r>
       <w:r>
         <w:rPr>
-          <w:rFonts w:ascii="Consolas" w:hAnsi="Consolas"/>
+          <w:rFonts w:ascii="Consolas" w:hAnsi="Consolas" w:eastAsia="Consolas"/>
           <w:sz w:val="21"/>
         </w:rPr>
         <w:t>)</w:t>
@@ -935,958 +746,8 @@
     </w:p>
     <w:p>
       <w:pPr>
-        <w:spacing w:after="160"/>
-        <w:ind w:left="680"/>
-      </w:pPr>
-      <w:r>
-        <w:rPr>
-          <w:i/>
-          <w:color w:val="5A5868"/>
-          <w:sz w:val="18"/>
-        </w:rPr>
-        <w:t>FK: identificacion → PERSONA(identificacion). PK compuesta: (identificacion, numero).</w:t>
-      </w:r>
-    </w:p>
-    <w:p>
-      <w:pPr>
-        <w:pStyle w:val="Heading2"/>
-      </w:pPr>
-      <w:r>
-        <w:t>Paso 3 · Relaciones 1:N</w:t>
-      </w:r>
-    </w:p>
-    <w:p>
-      <w:r>
-        <w:rPr>
-          <w:b w:val="0"/>
-          <w:i w:val="0"/>
-        </w:rPr>
-        <w:t>Regla: la llave primaria del lado 1 pasa como llave foránea a la relación del lado N. La relación desaparece como tabla, porque no tiene atributos propios.</w:t>
-      </w:r>
-    </w:p>
-    <w:tbl>
-      <w:tblPr>
-        <w:tblStyle w:val="TableGrid"/>
-        <w:tblW w:type="auto" w:w="0"/>
-        <w:jc w:val="center"/>
-        <w:tblLook w:firstColumn="1" w:firstRow="1" w:lastColumn="0" w:lastRow="0" w:noHBand="0" w:noVBand="1" w:val="04A0"/>
-      </w:tblPr>
-      <w:tblGrid>
-        <w:gridCol w:w="2408"/>
-        <w:gridCol w:w="2408"/>
-        <w:gridCol w:w="2408"/>
-        <w:gridCol w:w="2408"/>
-      </w:tblGrid>
-      <w:tr>
-        <w:tc>
-          <w:tcPr>
-            <w:tcW w:type="dxa" w:w="2381"/>
-            <w:shd w:val="clear" w:fill="EDECFC"/>
-          </w:tcPr>
-          <w:p>
-            <w:pPr>
-              <w:jc w:val="center"/>
-            </w:pPr>
-            <w:r/>
-            <w:r>
-              <w:rPr>
-                <w:b/>
-                <w:color w:val="5A5868"/>
-                <w:sz w:val="19"/>
-              </w:rPr>
-              <w:t>Relación del diagrama</w:t>
-            </w:r>
-          </w:p>
-        </w:tc>
-        <w:tc>
-          <w:tcPr>
-            <w:tcW w:type="dxa" w:w="1928"/>
-            <w:shd w:val="clear" w:fill="EDECFC"/>
-          </w:tcPr>
-          <w:p>
-            <w:pPr>
-              <w:jc w:val="center"/>
-            </w:pPr>
-            <w:r/>
-            <w:r>
-              <w:rPr>
-                <w:b/>
-                <w:color w:val="5A5868"/>
-                <w:sz w:val="19"/>
-              </w:rPr>
-              <w:t>Lado 1</w:t>
-            </w:r>
-          </w:p>
-        </w:tc>
-        <w:tc>
-          <w:tcPr>
-            <w:tcW w:type="dxa" w:w="1928"/>
-            <w:shd w:val="clear" w:fill="EDECFC"/>
-          </w:tcPr>
-          <w:p>
-            <w:pPr>
-              <w:jc w:val="center"/>
-            </w:pPr>
-            <w:r/>
-            <w:r>
-              <w:rPr>
-                <w:b/>
-                <w:color w:val="5A5868"/>
-                <w:sz w:val="19"/>
-              </w:rPr>
-              <w:t>Lado N</w:t>
-            </w:r>
-          </w:p>
-        </w:tc>
-        <w:tc>
-          <w:tcPr>
-            <w:tcW w:type="dxa" w:w="3061"/>
-            <w:shd w:val="clear" w:fill="EDECFC"/>
-          </w:tcPr>
-          <w:p>
-            <w:pPr>
-              <w:jc w:val="center"/>
-            </w:pPr>
-            <w:r/>
-            <w:r>
-              <w:rPr>
-                <w:b/>
-                <w:color w:val="5A5868"/>
-                <w:sz w:val="19"/>
-              </w:rPr>
-              <w:t>Llave foránea que se agrega</w:t>
-            </w:r>
-          </w:p>
-        </w:tc>
-      </w:tr>
-      <w:tr>
-        <w:tc>
-          <w:tcPr>
-            <w:tcW w:type="dxa" w:w="2381"/>
-          </w:tcPr>
-          <w:p>
-            <w:pPr>
-              <w:spacing w:after="20"/>
-            </w:pPr>
-            <w:r/>
-            <w:r>
-              <w:rPr>
-                <w:sz w:val="19"/>
-              </w:rPr>
-              <w:t>tiene</w:t>
-            </w:r>
-          </w:p>
-        </w:tc>
-        <w:tc>
-          <w:tcPr>
-            <w:tcW w:type="dxa" w:w="1928"/>
-          </w:tcPr>
-          <w:p>
-            <w:pPr>
-              <w:spacing w:after="20"/>
-            </w:pPr>
-            <w:r/>
-            <w:r>
-              <w:rPr>
-                <w:sz w:val="19"/>
-              </w:rPr>
-              <w:t>PAIS</w:t>
-            </w:r>
-          </w:p>
-        </w:tc>
-        <w:tc>
-          <w:tcPr>
-            <w:tcW w:type="dxa" w:w="1928"/>
-          </w:tcPr>
-          <w:p>
-            <w:pPr>
-              <w:spacing w:after="20"/>
-            </w:pPr>
-            <w:r/>
-            <w:r>
-              <w:rPr>
-                <w:sz w:val="19"/>
-              </w:rPr>
-              <w:t>DEPARTAMENTO</w:t>
-            </w:r>
-          </w:p>
-        </w:tc>
-        <w:tc>
-          <w:tcPr>
-            <w:tcW w:type="dxa" w:w="3061"/>
-          </w:tcPr>
-          <w:p>
-            <w:pPr>
-              <w:spacing w:after="20"/>
-            </w:pPr>
-            <w:r/>
-            <w:r>
-              <w:rPr>
-                <w:sz w:val="19"/>
-              </w:rPr>
-              <w:t>DEPARTAMENTO.id_pais</w:t>
-            </w:r>
-          </w:p>
-        </w:tc>
-      </w:tr>
-      <w:tr>
-        <w:tc>
-          <w:tcPr>
-            <w:tcW w:type="dxa" w:w="2381"/>
-          </w:tcPr>
-          <w:p>
-            <w:pPr>
-              <w:spacing w:after="20"/>
-            </w:pPr>
-            <w:r/>
-            <w:r>
-              <w:rPr>
-                <w:sz w:val="19"/>
-              </w:rPr>
-              <w:t>tiene</w:t>
-            </w:r>
-          </w:p>
-        </w:tc>
-        <w:tc>
-          <w:tcPr>
-            <w:tcW w:type="dxa" w:w="1928"/>
-          </w:tcPr>
-          <w:p>
-            <w:pPr>
-              <w:spacing w:after="20"/>
-            </w:pPr>
-            <w:r/>
-            <w:r>
-              <w:rPr>
-                <w:sz w:val="19"/>
-              </w:rPr>
-              <w:t>DEPARTAMENTO</w:t>
-            </w:r>
-          </w:p>
-        </w:tc>
-        <w:tc>
-          <w:tcPr>
-            <w:tcW w:type="dxa" w:w="1928"/>
-          </w:tcPr>
-          <w:p>
-            <w:pPr>
-              <w:spacing w:after="20"/>
-            </w:pPr>
-            <w:r/>
-            <w:r>
-              <w:rPr>
-                <w:sz w:val="19"/>
-              </w:rPr>
-              <w:t>CIUDAD</w:t>
-            </w:r>
-          </w:p>
-        </w:tc>
-        <w:tc>
-          <w:tcPr>
-            <w:tcW w:type="dxa" w:w="3061"/>
-          </w:tcPr>
-          <w:p>
-            <w:pPr>
-              <w:spacing w:after="20"/>
-            </w:pPr>
-            <w:r/>
-            <w:r>
-              <w:rPr>
-                <w:sz w:val="19"/>
-              </w:rPr>
-              <w:t>CIUDAD.id_departamento</w:t>
-            </w:r>
-          </w:p>
-        </w:tc>
-      </w:tr>
-      <w:tr>
-        <w:tc>
-          <w:tcPr>
-            <w:tcW w:type="dxa" w:w="2381"/>
-          </w:tcPr>
-          <w:p>
-            <w:pPr>
-              <w:spacing w:after="20"/>
-            </w:pPr>
-            <w:r/>
-            <w:r>
-              <w:rPr>
-                <w:sz w:val="19"/>
-              </w:rPr>
-              <w:t>reside en</w:t>
-            </w:r>
-          </w:p>
-        </w:tc>
-        <w:tc>
-          <w:tcPr>
-            <w:tcW w:type="dxa" w:w="1928"/>
-          </w:tcPr>
-          <w:p>
-            <w:pPr>
-              <w:spacing w:after="20"/>
-            </w:pPr>
-            <w:r/>
-            <w:r>
-              <w:rPr>
-                <w:sz w:val="19"/>
-              </w:rPr>
-              <w:t>CIUDAD</w:t>
-            </w:r>
-          </w:p>
-        </w:tc>
-        <w:tc>
-          <w:tcPr>
-            <w:tcW w:type="dxa" w:w="1928"/>
-          </w:tcPr>
-          <w:p>
-            <w:pPr>
-              <w:spacing w:after="20"/>
-            </w:pPr>
-            <w:r/>
-            <w:r>
-              <w:rPr>
-                <w:sz w:val="19"/>
-              </w:rPr>
-              <w:t>PERSONA</w:t>
-            </w:r>
-          </w:p>
-        </w:tc>
-        <w:tc>
-          <w:tcPr>
-            <w:tcW w:type="dxa" w:w="3061"/>
-          </w:tcPr>
-          <w:p>
-            <w:pPr>
-              <w:spacing w:after="20"/>
-            </w:pPr>
-            <w:r/>
-            <w:r>
-              <w:rPr>
-                <w:sz w:val="19"/>
-              </w:rPr>
-              <w:t>PERSONA.id_ciudad</w:t>
-            </w:r>
-          </w:p>
-        </w:tc>
-      </w:tr>
-      <w:tr>
-        <w:tc>
-          <w:tcPr>
-            <w:tcW w:type="dxa" w:w="2381"/>
-          </w:tcPr>
-          <w:p>
-            <w:pPr>
-              <w:spacing w:after="20"/>
-            </w:pPr>
-            <w:r/>
-            <w:r>
-              <w:rPr>
-                <w:sz w:val="19"/>
-              </w:rPr>
-              <w:t>se realiza en</w:t>
-            </w:r>
-          </w:p>
-        </w:tc>
-        <w:tc>
-          <w:tcPr>
-            <w:tcW w:type="dxa" w:w="1928"/>
-          </w:tcPr>
-          <w:p>
-            <w:pPr>
-              <w:spacing w:after="20"/>
-            </w:pPr>
-            <w:r/>
-            <w:r>
-              <w:rPr>
-                <w:sz w:val="19"/>
-              </w:rPr>
-              <w:t>CIUDAD</w:t>
-            </w:r>
-          </w:p>
-        </w:tc>
-        <w:tc>
-          <w:tcPr>
-            <w:tcW w:type="dxa" w:w="1928"/>
-          </w:tcPr>
-          <w:p>
-            <w:pPr>
-              <w:spacing w:after="20"/>
-            </w:pPr>
-            <w:r/>
-            <w:r>
-              <w:rPr>
-                <w:sz w:val="19"/>
-              </w:rPr>
-              <w:t>EVENTO</w:t>
-            </w:r>
-          </w:p>
-        </w:tc>
-        <w:tc>
-          <w:tcPr>
-            <w:tcW w:type="dxa" w:w="3061"/>
-          </w:tcPr>
-          <w:p>
-            <w:pPr>
-              <w:spacing w:after="20"/>
-            </w:pPr>
-            <w:r/>
-            <w:r>
-              <w:rPr>
-                <w:sz w:val="19"/>
-              </w:rPr>
-              <w:t>EVENTO.id_ciudad</w:t>
-            </w:r>
-          </w:p>
-        </w:tc>
-      </w:tr>
-      <w:tr>
-        <w:tc>
-          <w:tcPr>
-            <w:tcW w:type="dxa" w:w="2381"/>
-          </w:tcPr>
-          <w:p>
-            <w:pPr>
-              <w:spacing w:after="20"/>
-            </w:pPr>
-            <w:r/>
-            <w:r>
-              <w:rPr>
-                <w:sz w:val="19"/>
-              </w:rPr>
-              <w:t>registra</w:t>
-            </w:r>
-          </w:p>
-        </w:tc>
-        <w:tc>
-          <w:tcPr>
-            <w:tcW w:type="dxa" w:w="1928"/>
-          </w:tcPr>
-          <w:p>
-            <w:pPr>
-              <w:spacing w:after="20"/>
-            </w:pPr>
-            <w:r/>
-            <w:r>
-              <w:rPr>
-                <w:sz w:val="19"/>
-              </w:rPr>
-              <w:t>AGENTE</w:t>
-            </w:r>
-          </w:p>
-        </w:tc>
-        <w:tc>
-          <w:tcPr>
-            <w:tcW w:type="dxa" w:w="1928"/>
-          </w:tcPr>
-          <w:p>
-            <w:pPr>
-              <w:spacing w:after="20"/>
-            </w:pPr>
-            <w:r/>
-            <w:r>
-              <w:rPr>
-                <w:sz w:val="19"/>
-              </w:rPr>
-              <w:t>EVENTO</w:t>
-            </w:r>
-          </w:p>
-        </w:tc>
-        <w:tc>
-          <w:tcPr>
-            <w:tcW w:type="dxa" w:w="3061"/>
-          </w:tcPr>
-          <w:p>
-            <w:pPr>
-              <w:spacing w:after="20"/>
-            </w:pPr>
-            <w:r/>
-            <w:r>
-              <w:rPr>
-                <w:sz w:val="19"/>
-              </w:rPr>
-              <w:t>EVENTO.identificacion_agente</w:t>
-            </w:r>
-          </w:p>
-        </w:tc>
-      </w:tr>
-      <w:tr>
-        <w:tc>
-          <w:tcPr>
-            <w:tcW w:type="dxa" w:w="2381"/>
-          </w:tcPr>
-          <w:p>
-            <w:pPr>
-              <w:spacing w:after="20"/>
-            </w:pPr>
-            <w:r/>
-            <w:r>
-              <w:rPr>
-                <w:sz w:val="19"/>
-              </w:rPr>
-              <w:t>realiza</w:t>
-            </w:r>
-          </w:p>
-        </w:tc>
-        <w:tc>
-          <w:tcPr>
-            <w:tcW w:type="dxa" w:w="1928"/>
-          </w:tcPr>
-          <w:p>
-            <w:pPr>
-              <w:spacing w:after="20"/>
-            </w:pPr>
-            <w:r/>
-            <w:r>
-              <w:rPr>
-                <w:sz w:val="19"/>
-              </w:rPr>
-              <w:t>CLIENTE</w:t>
-            </w:r>
-          </w:p>
-        </w:tc>
-        <w:tc>
-          <w:tcPr>
-            <w:tcW w:type="dxa" w:w="1928"/>
-          </w:tcPr>
-          <w:p>
-            <w:pPr>
-              <w:spacing w:after="20"/>
-            </w:pPr>
-            <w:r/>
-            <w:r>
-              <w:rPr>
-                <w:sz w:val="19"/>
-              </w:rPr>
-              <w:t>RESERVA</w:t>
-            </w:r>
-          </w:p>
-        </w:tc>
-        <w:tc>
-          <w:tcPr>
-            <w:tcW w:type="dxa" w:w="3061"/>
-          </w:tcPr>
-          <w:p>
-            <w:pPr>
-              <w:spacing w:after="20"/>
-            </w:pPr>
-            <w:r/>
-            <w:r>
-              <w:rPr>
-                <w:sz w:val="19"/>
-              </w:rPr>
-              <w:t>RESERVA.identificacion_cliente</w:t>
-            </w:r>
-          </w:p>
-        </w:tc>
-      </w:tr>
-      <w:tr>
-        <w:tc>
-          <w:tcPr>
-            <w:tcW w:type="dxa" w:w="2381"/>
-          </w:tcPr>
-          <w:p>
-            <w:pPr>
-              <w:spacing w:after="20"/>
-            </w:pPr>
-            <w:r/>
-            <w:r>
-              <w:rPr>
-                <w:sz w:val="19"/>
-              </w:rPr>
-              <w:t>genera</w:t>
-            </w:r>
-          </w:p>
-        </w:tc>
-        <w:tc>
-          <w:tcPr>
-            <w:tcW w:type="dxa" w:w="1928"/>
-          </w:tcPr>
-          <w:p>
-            <w:pPr>
-              <w:spacing w:after="20"/>
-            </w:pPr>
-            <w:r/>
-            <w:r>
-              <w:rPr>
-                <w:sz w:val="19"/>
-              </w:rPr>
-              <w:t>EVENTO</w:t>
-            </w:r>
-          </w:p>
-        </w:tc>
-        <w:tc>
-          <w:tcPr>
-            <w:tcW w:type="dxa" w:w="1928"/>
-          </w:tcPr>
-          <w:p>
-            <w:pPr>
-              <w:spacing w:after="20"/>
-            </w:pPr>
-            <w:r/>
-            <w:r>
-              <w:rPr>
-                <w:sz w:val="19"/>
-              </w:rPr>
-              <w:t>RESERVA</w:t>
-            </w:r>
-          </w:p>
-        </w:tc>
-        <w:tc>
-          <w:tcPr>
-            <w:tcW w:type="dxa" w:w="3061"/>
-          </w:tcPr>
-          <w:p>
-            <w:pPr>
-              <w:spacing w:after="20"/>
-            </w:pPr>
-            <w:r/>
-            <w:r>
-              <w:rPr>
-                <w:sz w:val="19"/>
-              </w:rPr>
-              <w:t>RESERVA.codigo_evento</w:t>
-            </w:r>
-          </w:p>
-        </w:tc>
-      </w:tr>
-    </w:tbl>
-    <w:p/>
-    <w:p>
-      <w:pPr>
-        <w:spacing w:after="40"/>
-        <w:ind w:left="340"/>
-      </w:pPr>
-      <w:r>
-        <w:rPr>
-          <w:rFonts w:ascii="Consolas" w:hAnsi="Consolas" w:eastAsia="Consolas"/>
-          <w:b/>
-          <w:sz w:val="21"/>
-        </w:rPr>
-        <w:t>DEPARTAMENTO</w:t>
-      </w:r>
-      <w:r>
-        <w:rPr>
-          <w:rFonts w:ascii="Consolas" w:hAnsi="Consolas"/>
-          <w:sz w:val="21"/>
-        </w:rPr>
-        <w:t xml:space="preserve"> (</w:t>
-      </w:r>
-      <w:r>
-        <w:rPr>
-          <w:rFonts w:ascii="Consolas" w:hAnsi="Consolas" w:eastAsia="Consolas"/>
-          <w:b/>
-          <w:sz w:val="21"/>
-          <w:u w:val="single"/>
-        </w:rPr>
-        <w:t>id_departamento</w:t>
-      </w:r>
-      <w:r>
-        <w:rPr>
-          <w:rFonts w:ascii="Consolas" w:hAnsi="Consolas"/>
-          <w:sz w:val="21"/>
-        </w:rPr>
-        <w:t xml:space="preserve">, </w:t>
-      </w:r>
-      <w:r>
-        <w:rPr>
-          <w:rFonts w:ascii="Consolas" w:hAnsi="Consolas" w:eastAsia="Consolas"/>
-          <w:sz w:val="21"/>
-        </w:rPr>
-        <w:t>nombre</w:t>
-      </w:r>
-      <w:r>
-        <w:rPr>
-          <w:rFonts w:ascii="Consolas" w:hAnsi="Consolas"/>
-          <w:sz w:val="21"/>
-        </w:rPr>
-        <w:t xml:space="preserve">, </w:t>
-      </w:r>
-      <w:r>
-        <w:rPr>
-          <w:rFonts w:ascii="Consolas" w:hAnsi="Consolas" w:eastAsia="Consolas"/>
-          <w:color w:val="493EE5"/>
-          <w:sz w:val="21"/>
-        </w:rPr>
-        <w:t>id_pais</w:t>
-      </w:r>
-      <w:r>
-        <w:rPr>
-          <w:rFonts w:ascii="Consolas" w:hAnsi="Consolas"/>
-          <w:color w:val="493EE5"/>
-          <w:sz w:val="21"/>
-        </w:rPr>
-        <w:t>*</w:t>
-      </w:r>
-      <w:r>
-        <w:rPr>
-          <w:rFonts w:ascii="Consolas" w:hAnsi="Consolas"/>
-          <w:sz w:val="21"/>
-        </w:rPr>
-        <w:t>)</w:t>
-      </w:r>
-    </w:p>
-    <w:p>
-      <w:pPr>
-        <w:spacing w:after="160"/>
-        <w:ind w:left="680"/>
-      </w:pPr>
-      <w:r>
-        <w:rPr>
-          <w:i/>
-          <w:color w:val="5A5868"/>
-          <w:sz w:val="18"/>
-        </w:rPr>
-        <w:t>FK: id_pais → PAIS(id_pais)</w:t>
-      </w:r>
-    </w:p>
-    <w:p>
-      <w:pPr>
-        <w:spacing w:after="40"/>
-        <w:ind w:left="340"/>
-      </w:pPr>
-      <w:r>
-        <w:rPr>
-          <w:rFonts w:ascii="Consolas" w:hAnsi="Consolas" w:eastAsia="Consolas"/>
-          <w:b/>
-          <w:sz w:val="21"/>
-        </w:rPr>
-        <w:t>CIUDAD</w:t>
-      </w:r>
-      <w:r>
-        <w:rPr>
-          <w:rFonts w:ascii="Consolas" w:hAnsi="Consolas"/>
-          <w:sz w:val="21"/>
-        </w:rPr>
-        <w:t xml:space="preserve"> (</w:t>
-      </w:r>
-      <w:r>
-        <w:rPr>
-          <w:rFonts w:ascii="Consolas" w:hAnsi="Consolas" w:eastAsia="Consolas"/>
-          <w:b/>
-          <w:sz w:val="21"/>
-          <w:u w:val="single"/>
-        </w:rPr>
-        <w:t>id_ciudad</w:t>
-      </w:r>
-      <w:r>
-        <w:rPr>
-          <w:rFonts w:ascii="Consolas" w:hAnsi="Consolas"/>
-          <w:sz w:val="21"/>
-        </w:rPr>
-        <w:t xml:space="preserve">, </w:t>
-      </w:r>
-      <w:r>
-        <w:rPr>
-          <w:rFonts w:ascii="Consolas" w:hAnsi="Consolas" w:eastAsia="Consolas"/>
-          <w:sz w:val="21"/>
-        </w:rPr>
-        <w:t>nombre</w:t>
-      </w:r>
-      <w:r>
-        <w:rPr>
-          <w:rFonts w:ascii="Consolas" w:hAnsi="Consolas"/>
-          <w:sz w:val="21"/>
-        </w:rPr>
-        <w:t xml:space="preserve">, </w:t>
-      </w:r>
-      <w:r>
-        <w:rPr>
-          <w:rFonts w:ascii="Consolas" w:hAnsi="Consolas" w:eastAsia="Consolas"/>
-          <w:color w:val="493EE5"/>
-          <w:sz w:val="21"/>
-        </w:rPr>
-        <w:t>id_departamento</w:t>
-      </w:r>
-      <w:r>
-        <w:rPr>
-          <w:rFonts w:ascii="Consolas" w:hAnsi="Consolas"/>
-          <w:color w:val="493EE5"/>
-          <w:sz w:val="21"/>
-        </w:rPr>
-        <w:t>*</w:t>
-      </w:r>
-      <w:r>
-        <w:rPr>
-          <w:rFonts w:ascii="Consolas" w:hAnsi="Consolas"/>
-          <w:sz w:val="21"/>
-        </w:rPr>
-        <w:t>)</w:t>
-      </w:r>
-    </w:p>
-    <w:p>
-      <w:pPr>
-        <w:spacing w:after="160"/>
-        <w:ind w:left="680"/>
-      </w:pPr>
-      <w:r>
-        <w:rPr>
-          <w:i/>
-          <w:color w:val="5A5868"/>
-          <w:sz w:val="18"/>
-        </w:rPr>
-        <w:t>FK: id_departamento → DEPARTAMENTO(id_departamento)</w:t>
-      </w:r>
-    </w:p>
-    <w:p>
-      <w:pPr>
-        <w:spacing w:after="40"/>
-        <w:ind w:left="340"/>
-      </w:pPr>
-      <w:r>
-        <w:rPr>
-          <w:rFonts w:ascii="Consolas" w:hAnsi="Consolas" w:eastAsia="Consolas"/>
-          <w:b/>
-          <w:sz w:val="21"/>
-        </w:rPr>
-        <w:t>PERSONA</w:t>
-      </w:r>
-      <w:r>
-        <w:rPr>
-          <w:rFonts w:ascii="Consolas" w:hAnsi="Consolas"/>
-          <w:sz w:val="21"/>
-        </w:rPr>
-        <w:t xml:space="preserve"> (</w:t>
-      </w:r>
-      <w:r>
-        <w:rPr>
-          <w:rFonts w:ascii="Consolas" w:hAnsi="Consolas" w:eastAsia="Consolas"/>
-          <w:b/>
-          <w:sz w:val="21"/>
-          <w:u w:val="single"/>
-        </w:rPr>
-        <w:t>identificacion</w:t>
-      </w:r>
-      <w:r>
-        <w:rPr>
-          <w:rFonts w:ascii="Consolas" w:hAnsi="Consolas"/>
-          <w:sz w:val="21"/>
-        </w:rPr>
-        <w:t xml:space="preserve">, </w:t>
-      </w:r>
-      <w:r>
-        <w:rPr>
-          <w:rFonts w:ascii="Consolas" w:hAnsi="Consolas" w:eastAsia="Consolas"/>
-          <w:sz w:val="21"/>
-        </w:rPr>
-        <w:t>nombres</w:t>
-      </w:r>
-      <w:r>
-        <w:rPr>
-          <w:rFonts w:ascii="Consolas" w:hAnsi="Consolas"/>
-          <w:sz w:val="21"/>
-        </w:rPr>
-        <w:t xml:space="preserve">, </w:t>
-      </w:r>
-      <w:r>
-        <w:rPr>
-          <w:rFonts w:ascii="Consolas" w:hAnsi="Consolas" w:eastAsia="Consolas"/>
-          <w:sz w:val="21"/>
-        </w:rPr>
-        <w:t>apellidos</w:t>
-      </w:r>
-      <w:r>
-        <w:rPr>
-          <w:rFonts w:ascii="Consolas" w:hAnsi="Consolas"/>
-          <w:sz w:val="21"/>
-        </w:rPr>
-        <w:t xml:space="preserve">, </w:t>
-      </w:r>
-      <w:r>
-        <w:rPr>
-          <w:rFonts w:ascii="Consolas" w:hAnsi="Consolas" w:eastAsia="Consolas"/>
-          <w:sz w:val="21"/>
-        </w:rPr>
-        <w:t>correo</w:t>
-      </w:r>
-      <w:r>
-        <w:rPr>
-          <w:rFonts w:ascii="Consolas" w:hAnsi="Consolas"/>
-          <w:sz w:val="21"/>
-        </w:rPr>
-        <w:t xml:space="preserve">, </w:t>
-      </w:r>
-      <w:r>
-        <w:rPr>
-          <w:rFonts w:ascii="Consolas" w:hAnsi="Consolas" w:eastAsia="Consolas"/>
-          <w:sz w:val="21"/>
-        </w:rPr>
-        <w:t>direccion</w:t>
-      </w:r>
-      <w:r>
-        <w:rPr>
-          <w:rFonts w:ascii="Consolas" w:hAnsi="Consolas"/>
-          <w:sz w:val="21"/>
-        </w:rPr>
-        <w:t xml:space="preserve">, </w:t>
-      </w:r>
-      <w:r>
-        <w:rPr>
-          <w:rFonts w:ascii="Consolas" w:hAnsi="Consolas" w:eastAsia="Consolas"/>
-          <w:color w:val="493EE5"/>
-          <w:sz w:val="21"/>
-        </w:rPr>
-        <w:t>id_ciudad</w:t>
-      </w:r>
-      <w:r>
-        <w:rPr>
-          <w:rFonts w:ascii="Consolas" w:hAnsi="Consolas"/>
-          <w:color w:val="493EE5"/>
-          <w:sz w:val="21"/>
-        </w:rPr>
-        <w:t>*</w:t>
-      </w:r>
-      <w:r>
-        <w:rPr>
-          <w:rFonts w:ascii="Consolas" w:hAnsi="Consolas"/>
-          <w:sz w:val="21"/>
-        </w:rPr>
-        <w:t>)</w:t>
-      </w:r>
-    </w:p>
-    <w:p>
-      <w:pPr>
-        <w:spacing w:after="160"/>
-        <w:ind w:left="680"/>
-      </w:pPr>
-      <w:r>
-        <w:rPr>
-          <w:i/>
-          <w:color w:val="5A5868"/>
-          <w:sz w:val="18"/>
-        </w:rPr>
-        <w:t>FK: id_ciudad → CIUDAD(id_ciudad)</w:t>
-      </w:r>
-    </w:p>
-    <w:p>
-      <w:pPr>
-        <w:pStyle w:val="Heading2"/>
-      </w:pPr>
-      <w:r>
-        <w:t>Paso 4 · Relaciones 1:1 y jerarquía de subtipos</w:t>
-      </w:r>
-    </w:p>
-    <w:p>
-      <w:r>
-        <w:rPr>
-          <w:b w:val="0"/>
-          <w:i w:val="0"/>
-        </w:rPr>
-        <w:t>CLIENTE, AGENTE y ADMINISTRADOR son subtipos de PERSONA, unidos por relaciones 1:1. El documento de transformación plantea tres caminos para una jerarquía: reunir todo en una sola tabla, crear una tabla por subtipo eliminando el supertipo, o crear una tabla para el supertipo y una por cada subtipo.</w:t>
-      </w:r>
-    </w:p>
-    <w:p>
-      <w:r>
-        <w:rPr>
-          <w:b w:val="0"/>
-          <w:i w:val="0"/>
-        </w:rPr>
-        <w:t>Elegimos el tercero, que es el más usado y el que pide el enunciado del proyecto, porque este exige registrar, modificar, eliminar y consultar por separado personas, clientes, agentes y administradores. Cada subtipo recibe como llave primaria la llave del supertipo, que al mismo tiempo es llave foránea.</w:t>
-      </w:r>
-    </w:p>
-    <w:p>
-      <w:pPr>
-        <w:spacing w:after="40"/>
-        <w:ind w:left="340"/>
+        <w:spacing w:after="80"/>
+        <w:ind w:left="283"/>
       </w:pPr>
       <w:r>
         <w:rPr>
@@ -1898,7 +759,7 @@
       </w:r>
       <w:r>
         <w:rPr>
-          <w:rFonts w:ascii="Consolas" w:hAnsi="Consolas"/>
+          <w:rFonts w:ascii="Consolas" w:hAnsi="Consolas" w:eastAsia="Consolas"/>
           <w:sz w:val="21"/>
         </w:rPr>
         <w:t xml:space="preserve"> (</w:t>
@@ -1915,7 +776,7 @@
       </w:r>
       <w:r>
         <w:rPr>
-          <w:rFonts w:ascii="Consolas" w:hAnsi="Consolas"/>
+          <w:rFonts w:ascii="Consolas" w:hAnsi="Consolas" w:eastAsia="Consolas"/>
           <w:color w:val="493EE5"/>
           <w:sz w:val="21"/>
         </w:rPr>
@@ -1923,7 +784,7 @@
       </w:r>
       <w:r>
         <w:rPr>
-          <w:rFonts w:ascii="Consolas" w:hAnsi="Consolas"/>
+          <w:rFonts w:ascii="Consolas" w:hAnsi="Consolas" w:eastAsia="Consolas"/>
           <w:sz w:val="21"/>
         </w:rPr>
         <w:t xml:space="preserve">, </w:t>
@@ -1937,7 +798,7 @@
       </w:r>
       <w:r>
         <w:rPr>
-          <w:rFonts w:ascii="Consolas" w:hAnsi="Consolas"/>
+          <w:rFonts w:ascii="Consolas" w:hAnsi="Consolas" w:eastAsia="Consolas"/>
           <w:sz w:val="21"/>
         </w:rPr>
         <w:t xml:space="preserve">, </w:t>
@@ -1951,7 +812,7 @@
       </w:r>
       <w:r>
         <w:rPr>
-          <w:rFonts w:ascii="Consolas" w:hAnsi="Consolas"/>
+          <w:rFonts w:ascii="Consolas" w:hAnsi="Consolas" w:eastAsia="Consolas"/>
           <w:sz w:val="21"/>
         </w:rPr>
         <w:t>)</w:t>
@@ -1959,22 +820,8 @@
     </w:p>
     <w:p>
       <w:pPr>
-        <w:spacing w:after="160"/>
-        <w:ind w:left="680"/>
-      </w:pPr>
-      <w:r>
-        <w:rPr>
-          <w:i/>
-          <w:color w:val="5A5868"/>
-          <w:sz w:val="18"/>
-        </w:rPr>
-        <w:t>FK: identificacion → PERSONA(identificacion)</w:t>
-      </w:r>
-    </w:p>
-    <w:p>
-      <w:pPr>
-        <w:spacing w:after="40"/>
-        <w:ind w:left="340"/>
+        <w:spacing w:after="80"/>
+        <w:ind w:left="283"/>
       </w:pPr>
       <w:r>
         <w:rPr>
@@ -1986,7 +833,7 @@
       </w:r>
       <w:r>
         <w:rPr>
-          <w:rFonts w:ascii="Consolas" w:hAnsi="Consolas"/>
+          <w:rFonts w:ascii="Consolas" w:hAnsi="Consolas" w:eastAsia="Consolas"/>
           <w:sz w:val="21"/>
         </w:rPr>
         <w:t xml:space="preserve"> (</w:t>
@@ -2003,7 +850,7 @@
       </w:r>
       <w:r>
         <w:rPr>
-          <w:rFonts w:ascii="Consolas" w:hAnsi="Consolas"/>
+          <w:rFonts w:ascii="Consolas" w:hAnsi="Consolas" w:eastAsia="Consolas"/>
           <w:color w:val="493EE5"/>
           <w:sz w:val="21"/>
         </w:rPr>
@@ -2011,7 +858,7 @@
       </w:r>
       <w:r>
         <w:rPr>
-          <w:rFonts w:ascii="Consolas" w:hAnsi="Consolas"/>
+          <w:rFonts w:ascii="Consolas" w:hAnsi="Consolas" w:eastAsia="Consolas"/>
           <w:sz w:val="21"/>
         </w:rPr>
         <w:t xml:space="preserve">, </w:t>
@@ -2025,7 +872,7 @@
       </w:r>
       <w:r>
         <w:rPr>
-          <w:rFonts w:ascii="Consolas" w:hAnsi="Consolas"/>
+          <w:rFonts w:ascii="Consolas" w:hAnsi="Consolas" w:eastAsia="Consolas"/>
           <w:sz w:val="21"/>
         </w:rPr>
         <w:t xml:space="preserve">, </w:t>
@@ -2039,7 +886,7 @@
       </w:r>
       <w:r>
         <w:rPr>
-          <w:rFonts w:ascii="Consolas" w:hAnsi="Consolas"/>
+          <w:rFonts w:ascii="Consolas" w:hAnsi="Consolas" w:eastAsia="Consolas"/>
           <w:sz w:val="21"/>
         </w:rPr>
         <w:t>)</w:t>
@@ -2047,22 +894,8 @@
     </w:p>
     <w:p>
       <w:pPr>
-        <w:spacing w:after="160"/>
-        <w:ind w:left="680"/>
-      </w:pPr>
-      <w:r>
-        <w:rPr>
-          <w:i/>
-          <w:color w:val="5A5868"/>
-          <w:sz w:val="18"/>
-        </w:rPr>
-        <w:t>FK: identificacion → PERSONA(identificacion)</w:t>
-      </w:r>
-    </w:p>
-    <w:p>
-      <w:pPr>
-        <w:spacing w:after="40"/>
-        <w:ind w:left="340"/>
+        <w:spacing w:after="80"/>
+        <w:ind w:left="283"/>
       </w:pPr>
       <w:r>
         <w:rPr>
@@ -2074,7 +907,7 @@
       </w:r>
       <w:r>
         <w:rPr>
-          <w:rFonts w:ascii="Consolas" w:hAnsi="Consolas"/>
+          <w:rFonts w:ascii="Consolas" w:hAnsi="Consolas" w:eastAsia="Consolas"/>
           <w:sz w:val="21"/>
         </w:rPr>
         <w:t xml:space="preserve"> (</w:t>
@@ -2091,7 +924,7 @@
       </w:r>
       <w:r>
         <w:rPr>
-          <w:rFonts w:ascii="Consolas" w:hAnsi="Consolas"/>
+          <w:rFonts w:ascii="Consolas" w:hAnsi="Consolas" w:eastAsia="Consolas"/>
           <w:color w:val="493EE5"/>
           <w:sz w:val="21"/>
         </w:rPr>
@@ -2099,7 +932,7 @@
       </w:r>
       <w:r>
         <w:rPr>
-          <w:rFonts w:ascii="Consolas" w:hAnsi="Consolas"/>
+          <w:rFonts w:ascii="Consolas" w:hAnsi="Consolas" w:eastAsia="Consolas"/>
           <w:sz w:val="21"/>
         </w:rPr>
         <w:t xml:space="preserve">, </w:t>
@@ -2113,7 +946,7 @@
       </w:r>
       <w:r>
         <w:rPr>
-          <w:rFonts w:ascii="Consolas" w:hAnsi="Consolas"/>
+          <w:rFonts w:ascii="Consolas" w:hAnsi="Consolas" w:eastAsia="Consolas"/>
           <w:sz w:val="21"/>
         </w:rPr>
         <w:t xml:space="preserve">, </w:t>
@@ -2127,7 +960,7 @@
       </w:r>
       <w:r>
         <w:rPr>
-          <w:rFonts w:ascii="Consolas" w:hAnsi="Consolas"/>
+          <w:rFonts w:ascii="Consolas" w:hAnsi="Consolas" w:eastAsia="Consolas"/>
           <w:sz w:val="21"/>
         </w:rPr>
         <w:t>)</w:t>
@@ -2135,817 +968,8 @@
     </w:p>
     <w:p>
       <w:pPr>
-        <w:spacing w:after="160"/>
-        <w:ind w:left="680"/>
-      </w:pPr>
-      <w:r>
-        <w:rPr>
-          <w:i/>
-          <w:color w:val="5A5868"/>
-          <w:sz w:val="18"/>
-        </w:rPr>
-        <w:t>FK: identificacion → PERSONA(identificacion)</w:t>
-      </w:r>
-    </w:p>
-    <w:p>
-      <w:pPr>
-        <w:pStyle w:val="Heading2"/>
-      </w:pPr>
-      <w:r>
-        <w:t>Paso 5 · Relaciones N:M</w:t>
-      </w:r>
-    </w:p>
-    <w:p>
-      <w:r>
-        <w:rPr>
-          <w:b w:val="0"/>
-          <w:i w:val="0"/>
-        </w:rPr>
-        <w:t>Regla: una relación N:M se convierte en una tabla nueva, cuya llave primaria es la unión de las llaves de las entidades que asocia.</w:t>
-      </w:r>
-    </w:p>
-    <w:p>
-      <w:r>
-        <w:rPr>
-          <w:b w:val="0"/>
-          <w:i w:val="0"/>
-        </w:rPr>
-        <w:t>En el diagrama no queda ninguna N:M sin resolver. Entre CLIENTE y EVENTO existiría una (un cliente asiste a muchos eventos y un evento recibe muchos clientes), pero ya la resolvimos en el modelo conceptual: RESERVA es una entidad propia, con fecha, número de entradas, valor y estado, y por eso se relaciona 1:N con cada una de las dos.</w:t>
-      </w:r>
-    </w:p>
-    <w:p>
-      <w:r>
-        <w:rPr>
-          <w:b w:val="0"/>
-          <w:i/>
-          <w:color w:val="5A5868"/>
-          <w:sz w:val="20"/>
-        </w:rPr>
-        <w:t>Si RESERVA no guardara datos propios, la transformación habría sido:</w:t>
-      </w:r>
-    </w:p>
-    <w:p>
-      <w:pPr>
-        <w:spacing w:after="40"/>
-        <w:ind w:left="340"/>
-      </w:pPr>
-      <w:r>
-        <w:rPr>
-          <w:rFonts w:ascii="Consolas" w:hAnsi="Consolas" w:eastAsia="Consolas"/>
-          <w:b/>
-          <w:sz w:val="21"/>
-        </w:rPr>
-        <w:t>RESERVA_N_M</w:t>
-      </w:r>
-      <w:r>
-        <w:rPr>
-          <w:rFonts w:ascii="Consolas" w:hAnsi="Consolas"/>
-          <w:sz w:val="21"/>
-        </w:rPr>
-        <w:t xml:space="preserve"> (</w:t>
-      </w:r>
-      <w:r>
-        <w:rPr>
-          <w:rFonts w:ascii="Consolas" w:hAnsi="Consolas" w:eastAsia="Consolas"/>
-          <w:b/>
-          <w:color w:val="493EE5"/>
-          <w:sz w:val="21"/>
-          <w:u w:val="single"/>
-        </w:rPr>
-        <w:t>identificacion_cliente</w:t>
-      </w:r>
-      <w:r>
-        <w:rPr>
-          <w:rFonts w:ascii="Consolas" w:hAnsi="Consolas"/>
-          <w:color w:val="493EE5"/>
-          <w:sz w:val="21"/>
-        </w:rPr>
-        <w:t>*</w:t>
-      </w:r>
-      <w:r>
-        <w:rPr>
-          <w:rFonts w:ascii="Consolas" w:hAnsi="Consolas"/>
-          <w:sz w:val="21"/>
-        </w:rPr>
-        <w:t xml:space="preserve">, </w:t>
-      </w:r>
-      <w:r>
-        <w:rPr>
-          <w:rFonts w:ascii="Consolas" w:hAnsi="Consolas" w:eastAsia="Consolas"/>
-          <w:b/>
-          <w:color w:val="493EE5"/>
-          <w:sz w:val="21"/>
-          <w:u w:val="single"/>
-        </w:rPr>
-        <w:t>codigo_evento</w:t>
-      </w:r>
-      <w:r>
-        <w:rPr>
-          <w:rFonts w:ascii="Consolas" w:hAnsi="Consolas"/>
-          <w:color w:val="493EE5"/>
-          <w:sz w:val="21"/>
-        </w:rPr>
-        <w:t>*</w:t>
-      </w:r>
-      <w:r>
-        <w:rPr>
-          <w:rFonts w:ascii="Consolas" w:hAnsi="Consolas"/>
-          <w:sz w:val="21"/>
-        </w:rPr>
-        <w:t>)</w:t>
-      </w:r>
-    </w:p>
-    <w:p>
-      <w:pPr>
-        <w:spacing w:after="160"/>
-        <w:ind w:left="680"/>
-      </w:pPr>
-      <w:r>
-        <w:rPr>
-          <w:i/>
-          <w:color w:val="5A5868"/>
-          <w:sz w:val="18"/>
-        </w:rPr>
-        <w:t>Esta es la forma que NO usamos: perdería la fecha, el valor y el estado de la reserva.</w:t>
-      </w:r>
-    </w:p>
-    <w:p>
-      <w:pPr>
-        <w:pStyle w:val="Heading2"/>
-      </w:pPr>
-      <w:r>
-        <w:t>Paso 6 · Atributos multivaluados</w:t>
-      </w:r>
-    </w:p>
-    <w:p>
-      <w:r>
-        <w:rPr>
-          <w:b w:val="0"/>
-          <w:i w:val="0"/>
-        </w:rPr>
-        <w:t>Regla: un atributo multivaluado se convierte en una tabla aparte, con la llave foránea de su entidad y una columna para el atributo.</w:t>
-      </w:r>
-    </w:p>
-    <w:p>
-      <w:r>
-        <w:rPr>
-          <w:b w:val="0"/>
-          <w:i w:val="0"/>
-        </w:rPr>
-        <w:t>El teléfono es el único caso: el enunciado dice que una persona puede tener varios. Lo modelamos como entidad débil en el paso 2, y el resultado es exactamente el mismo que si lo hubiéramos tratado como atributo multivaluado: la tabla TELEFONO con llave primaria (identificacion, numero).</w:t>
-      </w:r>
-    </w:p>
-    <w:p>
-      <w:pPr>
-        <w:pStyle w:val="Heading2"/>
-      </w:pPr>
-      <w:r>
-        <w:t>Paso 7 · Relaciones n-arias</w:t>
-      </w:r>
-    </w:p>
-    <w:p>
-      <w:r>
-        <w:rPr>
-          <w:b w:val="0"/>
-          <w:i w:val="0"/>
-        </w:rPr>
-        <w:t>Regla: una relación en la que participan más de dos entidades se convierte en una tabla con las llaves foráneas de todas ellas.</w:t>
-      </w:r>
-    </w:p>
-    <w:p>
-      <w:r>
-        <w:rPr>
-          <w:b w:val="0"/>
-          <w:i w:val="0"/>
-        </w:rPr>
-        <w:t>No aplica: las once relaciones del diagrama son binarias. La que podría parecer ternaria —cliente, evento y reserva— no lo es, porque la reserva es una entidad y no una relación.</w:t>
-      </w:r>
-    </w:p>
-    <w:p>
-      <w:r>
-        <w:br w:type="page"/>
-      </w:r>
-    </w:p>
-    <w:p>
-      <w:pPr>
-        <w:pStyle w:val="Heading1"/>
-      </w:pPr>
-      <w:r>
-        <w:t>3. Esquema relacional resultante</w:t>
-      </w:r>
-    </w:p>
-    <w:p>
-      <w:r>
-        <w:rPr>
-          <w:b w:val="0"/>
-          <w:i w:val="0"/>
-        </w:rPr>
-        <w:t>Diez relaciones. La llave primaria va subrayada y las llaves foráneas en azul con asterisco.</w:t>
-      </w:r>
-    </w:p>
-    <w:p>
-      <w:pPr>
-        <w:spacing w:after="40"/>
-        <w:ind w:left="340"/>
-      </w:pPr>
-      <w:r>
-        <w:rPr>
-          <w:rFonts w:ascii="Consolas" w:hAnsi="Consolas" w:eastAsia="Consolas"/>
-          <w:b/>
-          <w:sz w:val="21"/>
-        </w:rPr>
-        <w:t>PAIS</w:t>
-      </w:r>
-      <w:r>
-        <w:rPr>
-          <w:rFonts w:ascii="Consolas" w:hAnsi="Consolas"/>
-          <w:sz w:val="21"/>
-        </w:rPr>
-        <w:t xml:space="preserve"> (</w:t>
-      </w:r>
-      <w:r>
-        <w:rPr>
-          <w:rFonts w:ascii="Consolas" w:hAnsi="Consolas" w:eastAsia="Consolas"/>
-          <w:b/>
-          <w:sz w:val="21"/>
-          <w:u w:val="single"/>
-        </w:rPr>
-        <w:t>id_pais</w:t>
-      </w:r>
-      <w:r>
-        <w:rPr>
-          <w:rFonts w:ascii="Consolas" w:hAnsi="Consolas"/>
-          <w:sz w:val="21"/>
-        </w:rPr>
-        <w:t xml:space="preserve">, </w:t>
-      </w:r>
-      <w:r>
-        <w:rPr>
-          <w:rFonts w:ascii="Consolas" w:hAnsi="Consolas" w:eastAsia="Consolas"/>
-          <w:sz w:val="21"/>
-        </w:rPr>
-        <w:t>nombre</w:t>
-      </w:r>
-      <w:r>
-        <w:rPr>
-          <w:rFonts w:ascii="Consolas" w:hAnsi="Consolas"/>
-          <w:sz w:val="21"/>
-        </w:rPr>
-        <w:t>)</w:t>
-      </w:r>
-    </w:p>
-    <w:p>
-      <w:pPr>
-        <w:spacing w:after="40"/>
-        <w:ind w:left="340"/>
-      </w:pPr>
-      <w:r>
-        <w:rPr>
-          <w:rFonts w:ascii="Consolas" w:hAnsi="Consolas" w:eastAsia="Consolas"/>
-          <w:b/>
-          <w:sz w:val="21"/>
-        </w:rPr>
-        <w:t>DEPARTAMENTO</w:t>
-      </w:r>
-      <w:r>
-        <w:rPr>
-          <w:rFonts w:ascii="Consolas" w:hAnsi="Consolas"/>
-          <w:sz w:val="21"/>
-        </w:rPr>
-        <w:t xml:space="preserve"> (</w:t>
-      </w:r>
-      <w:r>
-        <w:rPr>
-          <w:rFonts w:ascii="Consolas" w:hAnsi="Consolas" w:eastAsia="Consolas"/>
-          <w:b/>
-          <w:sz w:val="21"/>
-          <w:u w:val="single"/>
-        </w:rPr>
-        <w:t>id_departamento</w:t>
-      </w:r>
-      <w:r>
-        <w:rPr>
-          <w:rFonts w:ascii="Consolas" w:hAnsi="Consolas"/>
-          <w:sz w:val="21"/>
-        </w:rPr>
-        <w:t xml:space="preserve">, </w:t>
-      </w:r>
-      <w:r>
-        <w:rPr>
-          <w:rFonts w:ascii="Consolas" w:hAnsi="Consolas" w:eastAsia="Consolas"/>
-          <w:sz w:val="21"/>
-        </w:rPr>
-        <w:t>nombre</w:t>
-      </w:r>
-      <w:r>
-        <w:rPr>
-          <w:rFonts w:ascii="Consolas" w:hAnsi="Consolas"/>
-          <w:sz w:val="21"/>
-        </w:rPr>
-        <w:t xml:space="preserve">, </w:t>
-      </w:r>
-      <w:r>
-        <w:rPr>
-          <w:rFonts w:ascii="Consolas" w:hAnsi="Consolas" w:eastAsia="Consolas"/>
-          <w:color w:val="493EE5"/>
-          <w:sz w:val="21"/>
-        </w:rPr>
-        <w:t>id_pais</w:t>
-      </w:r>
-      <w:r>
-        <w:rPr>
-          <w:rFonts w:ascii="Consolas" w:hAnsi="Consolas"/>
-          <w:color w:val="493EE5"/>
-          <w:sz w:val="21"/>
-        </w:rPr>
-        <w:t>*</w:t>
-      </w:r>
-      <w:r>
-        <w:rPr>
-          <w:rFonts w:ascii="Consolas" w:hAnsi="Consolas"/>
-          <w:sz w:val="21"/>
-        </w:rPr>
-        <w:t>)</w:t>
-      </w:r>
-    </w:p>
-    <w:p>
-      <w:pPr>
-        <w:spacing w:after="40"/>
-        <w:ind w:left="340"/>
-      </w:pPr>
-      <w:r>
-        <w:rPr>
-          <w:rFonts w:ascii="Consolas" w:hAnsi="Consolas" w:eastAsia="Consolas"/>
-          <w:b/>
-          <w:sz w:val="21"/>
-        </w:rPr>
-        <w:t>CIUDAD</w:t>
-      </w:r>
-      <w:r>
-        <w:rPr>
-          <w:rFonts w:ascii="Consolas" w:hAnsi="Consolas"/>
-          <w:sz w:val="21"/>
-        </w:rPr>
-        <w:t xml:space="preserve"> (</w:t>
-      </w:r>
-      <w:r>
-        <w:rPr>
-          <w:rFonts w:ascii="Consolas" w:hAnsi="Consolas" w:eastAsia="Consolas"/>
-          <w:b/>
-          <w:sz w:val="21"/>
-          <w:u w:val="single"/>
-        </w:rPr>
-        <w:t>id_ciudad</w:t>
-      </w:r>
-      <w:r>
-        <w:rPr>
-          <w:rFonts w:ascii="Consolas" w:hAnsi="Consolas"/>
-          <w:sz w:val="21"/>
-        </w:rPr>
-        <w:t xml:space="preserve">, </w:t>
-      </w:r>
-      <w:r>
-        <w:rPr>
-          <w:rFonts w:ascii="Consolas" w:hAnsi="Consolas" w:eastAsia="Consolas"/>
-          <w:sz w:val="21"/>
-        </w:rPr>
-        <w:t>nombre</w:t>
-      </w:r>
-      <w:r>
-        <w:rPr>
-          <w:rFonts w:ascii="Consolas" w:hAnsi="Consolas"/>
-          <w:sz w:val="21"/>
-        </w:rPr>
-        <w:t xml:space="preserve">, </w:t>
-      </w:r>
-      <w:r>
-        <w:rPr>
-          <w:rFonts w:ascii="Consolas" w:hAnsi="Consolas" w:eastAsia="Consolas"/>
-          <w:color w:val="493EE5"/>
-          <w:sz w:val="21"/>
-        </w:rPr>
-        <w:t>id_departamento</w:t>
-      </w:r>
-      <w:r>
-        <w:rPr>
-          <w:rFonts w:ascii="Consolas" w:hAnsi="Consolas"/>
-          <w:color w:val="493EE5"/>
-          <w:sz w:val="21"/>
-        </w:rPr>
-        <w:t>*</w:t>
-      </w:r>
-      <w:r>
-        <w:rPr>
-          <w:rFonts w:ascii="Consolas" w:hAnsi="Consolas"/>
-          <w:sz w:val="21"/>
-        </w:rPr>
-        <w:t>)</w:t>
-      </w:r>
-    </w:p>
-    <w:p>
-      <w:pPr>
-        <w:spacing w:after="40"/>
-        <w:ind w:left="340"/>
-      </w:pPr>
-      <w:r>
-        <w:rPr>
-          <w:rFonts w:ascii="Consolas" w:hAnsi="Consolas" w:eastAsia="Consolas"/>
-          <w:b/>
-          <w:sz w:val="21"/>
-        </w:rPr>
-        <w:t>PERSONA</w:t>
-      </w:r>
-      <w:r>
-        <w:rPr>
-          <w:rFonts w:ascii="Consolas" w:hAnsi="Consolas"/>
-          <w:sz w:val="21"/>
-        </w:rPr>
-        <w:t xml:space="preserve"> (</w:t>
-      </w:r>
-      <w:r>
-        <w:rPr>
-          <w:rFonts w:ascii="Consolas" w:hAnsi="Consolas" w:eastAsia="Consolas"/>
-          <w:b/>
-          <w:sz w:val="21"/>
-          <w:u w:val="single"/>
-        </w:rPr>
-        <w:t>identificacion</w:t>
-      </w:r>
-      <w:r>
-        <w:rPr>
-          <w:rFonts w:ascii="Consolas" w:hAnsi="Consolas"/>
-          <w:sz w:val="21"/>
-        </w:rPr>
-        <w:t xml:space="preserve">, </w:t>
-      </w:r>
-      <w:r>
-        <w:rPr>
-          <w:rFonts w:ascii="Consolas" w:hAnsi="Consolas" w:eastAsia="Consolas"/>
-          <w:sz w:val="21"/>
-        </w:rPr>
-        <w:t>nombres</w:t>
-      </w:r>
-      <w:r>
-        <w:rPr>
-          <w:rFonts w:ascii="Consolas" w:hAnsi="Consolas"/>
-          <w:sz w:val="21"/>
-        </w:rPr>
-        <w:t xml:space="preserve">, </w:t>
-      </w:r>
-      <w:r>
-        <w:rPr>
-          <w:rFonts w:ascii="Consolas" w:hAnsi="Consolas" w:eastAsia="Consolas"/>
-          <w:sz w:val="21"/>
-        </w:rPr>
-        <w:t>apellidos</w:t>
-      </w:r>
-      <w:r>
-        <w:rPr>
-          <w:rFonts w:ascii="Consolas" w:hAnsi="Consolas"/>
-          <w:sz w:val="21"/>
-        </w:rPr>
-        <w:t xml:space="preserve">, </w:t>
-      </w:r>
-      <w:r>
-        <w:rPr>
-          <w:rFonts w:ascii="Consolas" w:hAnsi="Consolas" w:eastAsia="Consolas"/>
-          <w:sz w:val="21"/>
-        </w:rPr>
-        <w:t>correo</w:t>
-      </w:r>
-      <w:r>
-        <w:rPr>
-          <w:rFonts w:ascii="Consolas" w:hAnsi="Consolas"/>
-          <w:sz w:val="21"/>
-        </w:rPr>
-        <w:t xml:space="preserve">, </w:t>
-      </w:r>
-      <w:r>
-        <w:rPr>
-          <w:rFonts w:ascii="Consolas" w:hAnsi="Consolas" w:eastAsia="Consolas"/>
-          <w:sz w:val="21"/>
-        </w:rPr>
-        <w:t>direccion</w:t>
-      </w:r>
-      <w:r>
-        <w:rPr>
-          <w:rFonts w:ascii="Consolas" w:hAnsi="Consolas"/>
-          <w:sz w:val="21"/>
-        </w:rPr>
-        <w:t xml:space="preserve">, </w:t>
-      </w:r>
-      <w:r>
-        <w:rPr>
-          <w:rFonts w:ascii="Consolas" w:hAnsi="Consolas" w:eastAsia="Consolas"/>
-          <w:color w:val="493EE5"/>
-          <w:sz w:val="21"/>
-        </w:rPr>
-        <w:t>id_ciudad</w:t>
-      </w:r>
-      <w:r>
-        <w:rPr>
-          <w:rFonts w:ascii="Consolas" w:hAnsi="Consolas"/>
-          <w:color w:val="493EE5"/>
-          <w:sz w:val="21"/>
-        </w:rPr>
-        <w:t>*</w:t>
-      </w:r>
-      <w:r>
-        <w:rPr>
-          <w:rFonts w:ascii="Consolas" w:hAnsi="Consolas"/>
-          <w:sz w:val="21"/>
-        </w:rPr>
-        <w:t>)</w:t>
-      </w:r>
-    </w:p>
-    <w:p>
-      <w:pPr>
-        <w:spacing w:after="40"/>
-        <w:ind w:left="340"/>
-      </w:pPr>
-      <w:r>
-        <w:rPr>
-          <w:rFonts w:ascii="Consolas" w:hAnsi="Consolas" w:eastAsia="Consolas"/>
-          <w:b/>
-          <w:sz w:val="21"/>
-        </w:rPr>
-        <w:t>TELEFONO</w:t>
-      </w:r>
-      <w:r>
-        <w:rPr>
-          <w:rFonts w:ascii="Consolas" w:hAnsi="Consolas"/>
-          <w:sz w:val="21"/>
-        </w:rPr>
-        <w:t xml:space="preserve"> (</w:t>
-      </w:r>
-      <w:r>
-        <w:rPr>
-          <w:rFonts w:ascii="Consolas" w:hAnsi="Consolas" w:eastAsia="Consolas"/>
-          <w:b/>
-          <w:color w:val="493EE5"/>
-          <w:sz w:val="21"/>
-          <w:u w:val="single"/>
-        </w:rPr>
-        <w:t>identificacion</w:t>
-      </w:r>
-      <w:r>
-        <w:rPr>
-          <w:rFonts w:ascii="Consolas" w:hAnsi="Consolas"/>
-          <w:color w:val="493EE5"/>
-          <w:sz w:val="21"/>
-        </w:rPr>
-        <w:t>*</w:t>
-      </w:r>
-      <w:r>
-        <w:rPr>
-          <w:rFonts w:ascii="Consolas" w:hAnsi="Consolas"/>
-          <w:sz w:val="21"/>
-        </w:rPr>
-        <w:t xml:space="preserve">, </w:t>
-      </w:r>
-      <w:r>
-        <w:rPr>
-          <w:rFonts w:ascii="Consolas" w:hAnsi="Consolas" w:eastAsia="Consolas"/>
-          <w:b/>
-          <w:sz w:val="21"/>
-          <w:u w:val="single"/>
-        </w:rPr>
-        <w:t>numero</w:t>
-      </w:r>
-      <w:r>
-        <w:rPr>
-          <w:rFonts w:ascii="Consolas" w:hAnsi="Consolas"/>
-          <w:sz w:val="21"/>
-        </w:rPr>
-        <w:t>)</w:t>
-      </w:r>
-    </w:p>
-    <w:p>
-      <w:pPr>
-        <w:spacing w:after="40"/>
-        <w:ind w:left="340"/>
-      </w:pPr>
-      <w:r>
-        <w:rPr>
-          <w:rFonts w:ascii="Consolas" w:hAnsi="Consolas" w:eastAsia="Consolas"/>
-          <w:b/>
-          <w:sz w:val="21"/>
-        </w:rPr>
-        <w:t>CLIENTE</w:t>
-      </w:r>
-      <w:r>
-        <w:rPr>
-          <w:rFonts w:ascii="Consolas" w:hAnsi="Consolas"/>
-          <w:sz w:val="21"/>
-        </w:rPr>
-        <w:t xml:space="preserve"> (</w:t>
-      </w:r>
-      <w:r>
-        <w:rPr>
-          <w:rFonts w:ascii="Consolas" w:hAnsi="Consolas" w:eastAsia="Consolas"/>
-          <w:b/>
-          <w:color w:val="493EE5"/>
-          <w:sz w:val="21"/>
-          <w:u w:val="single"/>
-        </w:rPr>
-        <w:t>identificacion</w:t>
-      </w:r>
-      <w:r>
-        <w:rPr>
-          <w:rFonts w:ascii="Consolas" w:hAnsi="Consolas"/>
-          <w:color w:val="493EE5"/>
-          <w:sz w:val="21"/>
-        </w:rPr>
-        <w:t>*</w:t>
-      </w:r>
-      <w:r>
-        <w:rPr>
-          <w:rFonts w:ascii="Consolas" w:hAnsi="Consolas"/>
-          <w:sz w:val="21"/>
-        </w:rPr>
-        <w:t xml:space="preserve">, </w:t>
-      </w:r>
-      <w:r>
-        <w:rPr>
-          <w:rFonts w:ascii="Consolas" w:hAnsi="Consolas" w:eastAsia="Consolas"/>
-          <w:sz w:val="21"/>
-        </w:rPr>
-        <w:t>puntos</w:t>
-      </w:r>
-      <w:r>
-        <w:rPr>
-          <w:rFonts w:ascii="Consolas" w:hAnsi="Consolas"/>
-          <w:sz w:val="21"/>
-        </w:rPr>
-        <w:t xml:space="preserve">, </w:t>
-      </w:r>
-      <w:r>
-        <w:rPr>
-          <w:rFonts w:ascii="Consolas" w:hAnsi="Consolas" w:eastAsia="Consolas"/>
-          <w:sz w:val="21"/>
-        </w:rPr>
-        <w:t>ve_publicidad</w:t>
-      </w:r>
-      <w:r>
-        <w:rPr>
-          <w:rFonts w:ascii="Consolas" w:hAnsi="Consolas"/>
-          <w:sz w:val="21"/>
-        </w:rPr>
-        <w:t>)</w:t>
-      </w:r>
-    </w:p>
-    <w:p>
-      <w:pPr>
-        <w:spacing w:after="40"/>
-        <w:ind w:left="340"/>
-      </w:pPr>
-      <w:r>
-        <w:rPr>
-          <w:rFonts w:ascii="Consolas" w:hAnsi="Consolas" w:eastAsia="Consolas"/>
-          <w:b/>
-          <w:sz w:val="21"/>
-        </w:rPr>
-        <w:t>AGENTE</w:t>
-      </w:r>
-      <w:r>
-        <w:rPr>
-          <w:rFonts w:ascii="Consolas" w:hAnsi="Consolas"/>
-          <w:sz w:val="21"/>
-        </w:rPr>
-        <w:t xml:space="preserve"> (</w:t>
-      </w:r>
-      <w:r>
-        <w:rPr>
-          <w:rFonts w:ascii="Consolas" w:hAnsi="Consolas" w:eastAsia="Consolas"/>
-          <w:b/>
-          <w:color w:val="493EE5"/>
-          <w:sz w:val="21"/>
-          <w:u w:val="single"/>
-        </w:rPr>
-        <w:t>identificacion</w:t>
-      </w:r>
-      <w:r>
-        <w:rPr>
-          <w:rFonts w:ascii="Consolas" w:hAnsi="Consolas"/>
-          <w:color w:val="493EE5"/>
-          <w:sz w:val="21"/>
-        </w:rPr>
-        <w:t>*</w:t>
-      </w:r>
-      <w:r>
-        <w:rPr>
-          <w:rFonts w:ascii="Consolas" w:hAnsi="Consolas"/>
-          <w:sz w:val="21"/>
-        </w:rPr>
-        <w:t xml:space="preserve">, </w:t>
-      </w:r>
-      <w:r>
-        <w:rPr>
-          <w:rFonts w:ascii="Consolas" w:hAnsi="Consolas" w:eastAsia="Consolas"/>
-          <w:sz w:val="21"/>
-        </w:rPr>
-        <w:t>comision</w:t>
-      </w:r>
-      <w:r>
-        <w:rPr>
-          <w:rFonts w:ascii="Consolas" w:hAnsi="Consolas"/>
-          <w:sz w:val="21"/>
-        </w:rPr>
-        <w:t xml:space="preserve">, </w:t>
-      </w:r>
-      <w:r>
-        <w:rPr>
-          <w:rFonts w:ascii="Consolas" w:hAnsi="Consolas" w:eastAsia="Consolas"/>
-          <w:sz w:val="21"/>
-        </w:rPr>
-        <w:t>experiencia</w:t>
-      </w:r>
-      <w:r>
-        <w:rPr>
-          <w:rFonts w:ascii="Consolas" w:hAnsi="Consolas"/>
-          <w:sz w:val="21"/>
-        </w:rPr>
-        <w:t>)</w:t>
-      </w:r>
-    </w:p>
-    <w:p>
-      <w:pPr>
-        <w:spacing w:after="40"/>
-        <w:ind w:left="340"/>
-      </w:pPr>
-      <w:r>
-        <w:rPr>
-          <w:rFonts w:ascii="Consolas" w:hAnsi="Consolas" w:eastAsia="Consolas"/>
-          <w:b/>
-          <w:sz w:val="21"/>
-        </w:rPr>
-        <w:t>ADMINISTRADOR</w:t>
-      </w:r>
-      <w:r>
-        <w:rPr>
-          <w:rFonts w:ascii="Consolas" w:hAnsi="Consolas"/>
-          <w:sz w:val="21"/>
-        </w:rPr>
-        <w:t xml:space="preserve"> (</w:t>
-      </w:r>
-      <w:r>
-        <w:rPr>
-          <w:rFonts w:ascii="Consolas" w:hAnsi="Consolas" w:eastAsia="Consolas"/>
-          <w:b/>
-          <w:color w:val="493EE5"/>
-          <w:sz w:val="21"/>
-          <w:u w:val="single"/>
-        </w:rPr>
-        <w:t>identificacion</w:t>
-      </w:r>
-      <w:r>
-        <w:rPr>
-          <w:rFonts w:ascii="Consolas" w:hAnsi="Consolas"/>
-          <w:color w:val="493EE5"/>
-          <w:sz w:val="21"/>
-        </w:rPr>
-        <w:t>*</w:t>
-      </w:r>
-      <w:r>
-        <w:rPr>
-          <w:rFonts w:ascii="Consolas" w:hAnsi="Consolas"/>
-          <w:sz w:val="21"/>
-        </w:rPr>
-        <w:t xml:space="preserve">, </w:t>
-      </w:r>
-      <w:r>
-        <w:rPr>
-          <w:rFonts w:ascii="Consolas" w:hAnsi="Consolas" w:eastAsia="Consolas"/>
-          <w:sz w:val="21"/>
-        </w:rPr>
-        <w:t>salario</w:t>
-      </w:r>
-      <w:r>
-        <w:rPr>
-          <w:rFonts w:ascii="Consolas" w:hAnsi="Consolas"/>
-          <w:sz w:val="21"/>
-        </w:rPr>
-        <w:t xml:space="preserve">, </w:t>
-      </w:r>
-      <w:r>
-        <w:rPr>
-          <w:rFonts w:ascii="Consolas" w:hAnsi="Consolas" w:eastAsia="Consolas"/>
-          <w:sz w:val="21"/>
-        </w:rPr>
-        <w:t>horario</w:t>
-      </w:r>
-      <w:r>
-        <w:rPr>
-          <w:rFonts w:ascii="Consolas" w:hAnsi="Consolas"/>
-          <w:sz w:val="21"/>
-        </w:rPr>
-        <w:t>)</w:t>
-      </w:r>
-    </w:p>
-    <w:p>
-      <w:pPr>
-        <w:spacing w:after="40"/>
-        <w:ind w:left="340"/>
+        <w:spacing w:after="80"/>
+        <w:ind w:left="283"/>
       </w:pPr>
       <w:r>
         <w:rPr>
@@ -2957,7 +981,7 @@
       </w:r>
       <w:r>
         <w:rPr>
-          <w:rFonts w:ascii="Consolas" w:hAnsi="Consolas"/>
+          <w:rFonts w:ascii="Consolas" w:hAnsi="Consolas" w:eastAsia="Consolas"/>
           <w:sz w:val="21"/>
         </w:rPr>
         <w:t xml:space="preserve"> (</w:t>
@@ -2973,7 +997,7 @@
       </w:r>
       <w:r>
         <w:rPr>
-          <w:rFonts w:ascii="Consolas" w:hAnsi="Consolas"/>
+          <w:rFonts w:ascii="Consolas" w:hAnsi="Consolas" w:eastAsia="Consolas"/>
           <w:sz w:val="21"/>
         </w:rPr>
         <w:t xml:space="preserve">, </w:t>
@@ -2987,7 +1011,7 @@
       </w:r>
       <w:r>
         <w:rPr>
-          <w:rFonts w:ascii="Consolas" w:hAnsi="Consolas"/>
+          <w:rFonts w:ascii="Consolas" w:hAnsi="Consolas" w:eastAsia="Consolas"/>
           <w:sz w:val="21"/>
         </w:rPr>
         <w:t xml:space="preserve">, </w:t>
@@ -3001,7 +1025,7 @@
       </w:r>
       <w:r>
         <w:rPr>
-          <w:rFonts w:ascii="Consolas" w:hAnsi="Consolas"/>
+          <w:rFonts w:ascii="Consolas" w:hAnsi="Consolas" w:eastAsia="Consolas"/>
           <w:sz w:val="21"/>
         </w:rPr>
         <w:t xml:space="preserve">, </w:t>
@@ -3015,7 +1039,7 @@
       </w:r>
       <w:r>
         <w:rPr>
-          <w:rFonts w:ascii="Consolas" w:hAnsi="Consolas"/>
+          <w:rFonts w:ascii="Consolas" w:hAnsi="Consolas" w:eastAsia="Consolas"/>
           <w:sz w:val="21"/>
         </w:rPr>
         <w:t xml:space="preserve">, </w:t>
@@ -3029,7 +1053,7 @@
       </w:r>
       <w:r>
         <w:rPr>
-          <w:rFonts w:ascii="Consolas" w:hAnsi="Consolas"/>
+          <w:rFonts w:ascii="Consolas" w:hAnsi="Consolas" w:eastAsia="Consolas"/>
           <w:sz w:val="21"/>
         </w:rPr>
         <w:t xml:space="preserve">, </w:t>
@@ -3043,7 +1067,7 @@
       </w:r>
       <w:r>
         <w:rPr>
-          <w:rFonts w:ascii="Consolas" w:hAnsi="Consolas"/>
+          <w:rFonts w:ascii="Consolas" w:hAnsi="Consolas" w:eastAsia="Consolas"/>
           <w:sz w:val="21"/>
         </w:rPr>
         <w:t xml:space="preserve">, </w:t>
@@ -3057,7 +1081,7 @@
       </w:r>
       <w:r>
         <w:rPr>
-          <w:rFonts w:ascii="Consolas" w:hAnsi="Consolas"/>
+          <w:rFonts w:ascii="Consolas" w:hAnsi="Consolas" w:eastAsia="Consolas"/>
           <w:sz w:val="21"/>
         </w:rPr>
         <w:t xml:space="preserve">, </w:t>
@@ -3071,7 +1095,7 @@
       </w:r>
       <w:r>
         <w:rPr>
-          <w:rFonts w:ascii="Consolas" w:hAnsi="Consolas"/>
+          <w:rFonts w:ascii="Consolas" w:hAnsi="Consolas" w:eastAsia="Consolas"/>
           <w:sz w:val="21"/>
         </w:rPr>
         <w:t xml:space="preserve">, </w:t>
@@ -3085,7 +1109,7 @@
       </w:r>
       <w:r>
         <w:rPr>
-          <w:rFonts w:ascii="Consolas" w:hAnsi="Consolas"/>
+          <w:rFonts w:ascii="Consolas" w:hAnsi="Consolas" w:eastAsia="Consolas"/>
           <w:sz w:val="21"/>
         </w:rPr>
         <w:t xml:space="preserve">, </w:t>
@@ -3099,7 +1123,7 @@
       </w:r>
       <w:r>
         <w:rPr>
-          <w:rFonts w:ascii="Consolas" w:hAnsi="Consolas"/>
+          <w:rFonts w:ascii="Consolas" w:hAnsi="Consolas" w:eastAsia="Consolas"/>
           <w:sz w:val="21"/>
         </w:rPr>
         <w:t xml:space="preserve">, </w:t>
@@ -3114,7 +1138,7 @@
       </w:r>
       <w:r>
         <w:rPr>
-          <w:rFonts w:ascii="Consolas" w:hAnsi="Consolas"/>
+          <w:rFonts w:ascii="Consolas" w:hAnsi="Consolas" w:eastAsia="Consolas"/>
           <w:color w:val="493EE5"/>
           <w:sz w:val="21"/>
         </w:rPr>
@@ -3122,7 +1146,7 @@
       </w:r>
       <w:r>
         <w:rPr>
-          <w:rFonts w:ascii="Consolas" w:hAnsi="Consolas"/>
+          <w:rFonts w:ascii="Consolas" w:hAnsi="Consolas" w:eastAsia="Consolas"/>
           <w:sz w:val="21"/>
         </w:rPr>
         <w:t xml:space="preserve">, </w:t>
@@ -3137,7 +1161,7 @@
       </w:r>
       <w:r>
         <w:rPr>
-          <w:rFonts w:ascii="Consolas" w:hAnsi="Consolas"/>
+          <w:rFonts w:ascii="Consolas" w:hAnsi="Consolas" w:eastAsia="Consolas"/>
           <w:color w:val="493EE5"/>
           <w:sz w:val="21"/>
         </w:rPr>
@@ -3145,7 +1169,7 @@
       </w:r>
       <w:r>
         <w:rPr>
-          <w:rFonts w:ascii="Consolas" w:hAnsi="Consolas"/>
+          <w:rFonts w:ascii="Consolas" w:hAnsi="Consolas" w:eastAsia="Consolas"/>
           <w:sz w:val="21"/>
         </w:rPr>
         <w:t>)</w:t>
@@ -3153,8 +1177,8 @@
     </w:p>
     <w:p>
       <w:pPr>
-        <w:spacing w:after="40"/>
-        <w:ind w:left="340"/>
+        <w:spacing w:after="80"/>
+        <w:ind w:left="283"/>
       </w:pPr>
       <w:r>
         <w:rPr>
@@ -3166,7 +1190,7 @@
       </w:r>
       <w:r>
         <w:rPr>
-          <w:rFonts w:ascii="Consolas" w:hAnsi="Consolas"/>
+          <w:rFonts w:ascii="Consolas" w:hAnsi="Consolas" w:eastAsia="Consolas"/>
           <w:sz w:val="21"/>
         </w:rPr>
         <w:t xml:space="preserve"> (</w:t>
@@ -3182,7 +1206,7 @@
       </w:r>
       <w:r>
         <w:rPr>
-          <w:rFonts w:ascii="Consolas" w:hAnsi="Consolas"/>
+          <w:rFonts w:ascii="Consolas" w:hAnsi="Consolas" w:eastAsia="Consolas"/>
           <w:sz w:val="21"/>
         </w:rPr>
         <w:t xml:space="preserve">, </w:t>
@@ -3196,7 +1220,7 @@
       </w:r>
       <w:r>
         <w:rPr>
-          <w:rFonts w:ascii="Consolas" w:hAnsi="Consolas"/>
+          <w:rFonts w:ascii="Consolas" w:hAnsi="Consolas" w:eastAsia="Consolas"/>
           <w:sz w:val="21"/>
         </w:rPr>
         <w:t xml:space="preserve">, </w:t>
@@ -3210,7 +1234,7 @@
       </w:r>
       <w:r>
         <w:rPr>
-          <w:rFonts w:ascii="Consolas" w:hAnsi="Consolas"/>
+          <w:rFonts w:ascii="Consolas" w:hAnsi="Consolas" w:eastAsia="Consolas"/>
           <w:sz w:val="21"/>
         </w:rPr>
         <w:t xml:space="preserve">, </w:t>
@@ -3224,7 +1248,7 @@
       </w:r>
       <w:r>
         <w:rPr>
-          <w:rFonts w:ascii="Consolas" w:hAnsi="Consolas"/>
+          <w:rFonts w:ascii="Consolas" w:hAnsi="Consolas" w:eastAsia="Consolas"/>
           <w:sz w:val="21"/>
         </w:rPr>
         <w:t xml:space="preserve">, </w:t>
@@ -3238,7 +1262,7 @@
       </w:r>
       <w:r>
         <w:rPr>
-          <w:rFonts w:ascii="Consolas" w:hAnsi="Consolas"/>
+          <w:rFonts w:ascii="Consolas" w:hAnsi="Consolas" w:eastAsia="Consolas"/>
           <w:sz w:val="21"/>
         </w:rPr>
         <w:t xml:space="preserve">, </w:t>
@@ -3253,7 +1277,7 @@
       </w:r>
       <w:r>
         <w:rPr>
-          <w:rFonts w:ascii="Consolas" w:hAnsi="Consolas"/>
+          <w:rFonts w:ascii="Consolas" w:hAnsi="Consolas" w:eastAsia="Consolas"/>
           <w:color w:val="493EE5"/>
           <w:sz w:val="21"/>
         </w:rPr>
@@ -3261,7 +1285,7 @@
       </w:r>
       <w:r>
         <w:rPr>
-          <w:rFonts w:ascii="Consolas" w:hAnsi="Consolas"/>
+          <w:rFonts w:ascii="Consolas" w:hAnsi="Consolas" w:eastAsia="Consolas"/>
           <w:sz w:val="21"/>
         </w:rPr>
         <w:t xml:space="preserve">, </w:t>
@@ -3276,7 +1300,7 @@
       </w:r>
       <w:r>
         <w:rPr>
-          <w:rFonts w:ascii="Consolas" w:hAnsi="Consolas"/>
+          <w:rFonts w:ascii="Consolas" w:hAnsi="Consolas" w:eastAsia="Consolas"/>
           <w:color w:val="493EE5"/>
           <w:sz w:val="21"/>
         </w:rPr>
@@ -3284,7 +1308,7 @@
       </w:r>
       <w:r>
         <w:rPr>
-          <w:rFonts w:ascii="Consolas" w:hAnsi="Consolas"/>
+          <w:rFonts w:ascii="Consolas" w:hAnsi="Consolas" w:eastAsia="Consolas"/>
           <w:sz w:val="21"/>
         </w:rPr>
         <w:t>)</w:t>
@@ -3306,15 +1330,14 @@
         <w:tblLook w:firstColumn="1" w:firstRow="1" w:lastColumn="0" w:lastRow="0" w:noHBand="0" w:noVBand="1" w:val="04A0"/>
       </w:tblPr>
       <w:tblGrid>
-        <w:gridCol w:w="2408"/>
-        <w:gridCol w:w="2408"/>
-        <w:gridCol w:w="2408"/>
-        <w:gridCol w:w="2408"/>
+        <w:gridCol w:w="3173"/>
+        <w:gridCol w:w="3173"/>
+        <w:gridCol w:w="3173"/>
       </w:tblGrid>
       <w:tr>
         <w:tc>
           <w:tcPr>
-            <w:tcW w:type="dxa" w:w="1928"/>
+            <w:tcW w:type="dxa" w:w="2608"/>
             <w:shd w:val="clear" w:fill="EDECFC"/>
           </w:tcPr>
           <w:p>
@@ -3326,7 +1349,7 @@
               <w:rPr>
                 <w:b/>
                 <w:color w:val="5A5868"/>
-                <w:sz w:val="19"/>
+                <w:sz w:val="20"/>
               </w:rPr>
               <w:t>Tabla</w:t>
             </w:r>
@@ -3334,7 +1357,7 @@
         </w:tc>
         <w:tc>
           <w:tcPr>
-            <w:tcW w:type="dxa" w:w="2268"/>
+            <w:tcW w:type="dxa" w:w="3175"/>
             <w:shd w:val="clear" w:fill="EDECFC"/>
           </w:tcPr>
           <w:p>
@@ -3346,7 +1369,7 @@
               <w:rPr>
                 <w:b/>
                 <w:color w:val="5A5868"/>
-                <w:sz w:val="19"/>
+                <w:sz w:val="20"/>
               </w:rPr>
               <w:t>Llave foránea</w:t>
             </w:r>
@@ -3354,7 +1377,7 @@
         </w:tc>
         <w:tc>
           <w:tcPr>
-            <w:tcW w:type="dxa" w:w="2835"/>
+            <w:tcW w:type="dxa" w:w="3402"/>
             <w:shd w:val="clear" w:fill="EDECFC"/>
           </w:tcPr>
           <w:p>
@@ -3366,29 +1389,9 @@
               <w:rPr>
                 <w:b/>
                 <w:color w:val="5A5868"/>
-                <w:sz w:val="19"/>
+                <w:sz w:val="20"/>
               </w:rPr>
               <w:t>Apunta a</w:t>
-            </w:r>
-          </w:p>
-        </w:tc>
-        <w:tc>
-          <w:tcPr>
-            <w:tcW w:type="dxa" w:w="2268"/>
-            <w:shd w:val="clear" w:fill="EDECFC"/>
-          </w:tcPr>
-          <w:p>
-            <w:pPr>
-              <w:jc w:val="center"/>
-            </w:pPr>
-            <w:r/>
-            <w:r>
-              <w:rPr>
-                <w:b/>
-                <w:color w:val="5A5868"/>
-                <w:sz w:val="19"/>
-              </w:rPr>
-              <w:t>Qué representa</w:t>
             </w:r>
           </w:p>
         </w:tc>
@@ -3396,7 +1399,7 @@
       <w:tr>
         <w:tc>
           <w:tcPr>
-            <w:tcW w:type="dxa" w:w="1928"/>
+            <w:tcW w:type="dxa" w:w="2608"/>
           </w:tcPr>
           <w:p>
             <w:pPr>
@@ -3405,15 +1408,15 @@
             <w:r/>
             <w:r>
               <w:rPr>
-                <w:sz w:val="19"/>
+                <w:sz w:val="20"/>
               </w:rPr>
-              <w:t>DEPARTAMENTO</w:t>
+              <w:t>departamento</w:t>
             </w:r>
           </w:p>
         </w:tc>
         <w:tc>
           <w:tcPr>
-            <w:tcW w:type="dxa" w:w="2268"/>
+            <w:tcW w:type="dxa" w:w="3175"/>
           </w:tcPr>
           <w:p>
             <w:pPr>
@@ -3422,7 +1425,7 @@
             <w:r/>
             <w:r>
               <w:rPr>
-                <w:sz w:val="19"/>
+                <w:sz w:val="20"/>
               </w:rPr>
               <w:t>id_pais</w:t>
             </w:r>
@@ -3430,7 +1433,7 @@
         </w:tc>
         <w:tc>
           <w:tcPr>
-            <w:tcW w:type="dxa" w:w="2835"/>
+            <w:tcW w:type="dxa" w:w="3402"/>
           </w:tcPr>
           <w:p>
             <w:pPr>
@@ -3439,15 +1442,17 @@
             <w:r/>
             <w:r>
               <w:rPr>
-                <w:sz w:val="19"/>
+                <w:sz w:val="20"/>
               </w:rPr>
-              <w:t>PAIS(id_pais)</w:t>
+              <w:t>pais (id_pais)</w:t>
             </w:r>
           </w:p>
         </w:tc>
+      </w:tr>
+      <w:tr>
         <w:tc>
           <w:tcPr>
-            <w:tcW w:type="dxa" w:w="2268"/>
+            <w:tcW w:type="dxa" w:w="2608"/>
           </w:tcPr>
           <w:p>
             <w:pPr>
@@ -3456,17 +1461,15 @@
             <w:r/>
             <w:r>
               <w:rPr>
-                <w:sz w:val="19"/>
+                <w:sz w:val="20"/>
               </w:rPr>
-              <w:t>El país del departamento</w:t>
+              <w:t>ciudad</w:t>
             </w:r>
           </w:p>
         </w:tc>
-      </w:tr>
-      <w:tr>
         <w:tc>
           <w:tcPr>
-            <w:tcW w:type="dxa" w:w="1928"/>
+            <w:tcW w:type="dxa" w:w="3175"/>
           </w:tcPr>
           <w:p>
             <w:pPr>
@@ -3475,15 +1478,15 @@
             <w:r/>
             <w:r>
               <w:rPr>
-                <w:sz w:val="19"/>
+                <w:sz w:val="20"/>
               </w:rPr>
-              <w:t>CIUDAD</w:t>
+              <w:t>id_departamento</w:t>
             </w:r>
           </w:p>
         </w:tc>
         <w:tc>
           <w:tcPr>
-            <w:tcW w:type="dxa" w:w="2268"/>
+            <w:tcW w:type="dxa" w:w="3402"/>
           </w:tcPr>
           <w:p>
             <w:pPr>
@@ -3492,15 +1495,17 @@
             <w:r/>
             <w:r>
               <w:rPr>
-                <w:sz w:val="19"/>
+                <w:sz w:val="20"/>
               </w:rPr>
-              <w:t>id_departamento</w:t>
+              <w:t>departamento (id_departamento)</w:t>
             </w:r>
           </w:p>
         </w:tc>
+      </w:tr>
+      <w:tr>
         <w:tc>
           <w:tcPr>
-            <w:tcW w:type="dxa" w:w="2835"/>
+            <w:tcW w:type="dxa" w:w="2608"/>
           </w:tcPr>
           <w:p>
             <w:pPr>
@@ -3509,15 +1514,15 @@
             <w:r/>
             <w:r>
               <w:rPr>
-                <w:sz w:val="19"/>
+                <w:sz w:val="20"/>
               </w:rPr>
-              <w:t>DEPARTAMENTO(id_departamento)</w:t>
+              <w:t>persona</w:t>
             </w:r>
           </w:p>
         </w:tc>
         <w:tc>
           <w:tcPr>
-            <w:tcW w:type="dxa" w:w="2268"/>
+            <w:tcW w:type="dxa" w:w="3175"/>
           </w:tcPr>
           <w:p>
             <w:pPr>
@@ -3526,17 +1531,15 @@
             <w:r/>
             <w:r>
               <w:rPr>
-                <w:sz w:val="19"/>
+                <w:sz w:val="20"/>
               </w:rPr>
-              <w:t>El departamento de la ciudad</w:t>
+              <w:t>id_ciudad</w:t>
             </w:r>
           </w:p>
         </w:tc>
-      </w:tr>
-      <w:tr>
         <w:tc>
           <w:tcPr>
-            <w:tcW w:type="dxa" w:w="1928"/>
+            <w:tcW w:type="dxa" w:w="3402"/>
           </w:tcPr>
           <w:p>
             <w:pPr>
@@ -3545,15 +1548,17 @@
             <w:r/>
             <w:r>
               <w:rPr>
-                <w:sz w:val="19"/>
+                <w:sz w:val="20"/>
               </w:rPr>
-              <w:t>PERSONA</w:t>
+              <w:t>ciudad (id_ciudad)</w:t>
             </w:r>
           </w:p>
         </w:tc>
+      </w:tr>
+      <w:tr>
         <w:tc>
           <w:tcPr>
-            <w:tcW w:type="dxa" w:w="2268"/>
+            <w:tcW w:type="dxa" w:w="2608"/>
           </w:tcPr>
           <w:p>
             <w:pPr>
@@ -3562,15 +1567,15 @@
             <w:r/>
             <w:r>
               <w:rPr>
-                <w:sz w:val="19"/>
+                <w:sz w:val="20"/>
               </w:rPr>
-              <w:t>id_ciudad</w:t>
+              <w:t>telefono</w:t>
             </w:r>
           </w:p>
         </w:tc>
         <w:tc>
           <w:tcPr>
-            <w:tcW w:type="dxa" w:w="2835"/>
+            <w:tcW w:type="dxa" w:w="3175"/>
           </w:tcPr>
           <w:p>
             <w:pPr>
@@ -3579,15 +1584,15 @@
             <w:r/>
             <w:r>
               <w:rPr>
-                <w:sz w:val="19"/>
+                <w:sz w:val="20"/>
               </w:rPr>
-              <w:t>CIUDAD(id_ciudad)</w:t>
+              <w:t>identificacion</w:t>
             </w:r>
           </w:p>
         </w:tc>
         <w:tc>
           <w:tcPr>
-            <w:tcW w:type="dxa" w:w="2268"/>
+            <w:tcW w:type="dxa" w:w="3402"/>
           </w:tcPr>
           <w:p>
             <w:pPr>
@@ -3596,9 +1601,9 @@
             <w:r/>
             <w:r>
               <w:rPr>
-                <w:sz w:val="19"/>
+                <w:sz w:val="20"/>
               </w:rPr>
-              <w:t>La ciudad donde reside</w:t>
+              <w:t>persona (identificacion)</w:t>
             </w:r>
           </w:p>
         </w:tc>
@@ -3606,7 +1611,7 @@
       <w:tr>
         <w:tc>
           <w:tcPr>
-            <w:tcW w:type="dxa" w:w="1928"/>
+            <w:tcW w:type="dxa" w:w="2608"/>
           </w:tcPr>
           <w:p>
             <w:pPr>
@@ -3615,15 +1620,15 @@
             <w:r/>
             <w:r>
               <w:rPr>
-                <w:sz w:val="19"/>
+                <w:sz w:val="20"/>
               </w:rPr>
-              <w:t>TELEFONO</w:t>
+              <w:t>cliente</w:t>
             </w:r>
           </w:p>
         </w:tc>
         <w:tc>
           <w:tcPr>
-            <w:tcW w:type="dxa" w:w="2268"/>
+            <w:tcW w:type="dxa" w:w="3175"/>
           </w:tcPr>
           <w:p>
             <w:pPr>
@@ -3632,7 +1637,7 @@
             <w:r/>
             <w:r>
               <w:rPr>
-                <w:sz w:val="19"/>
+                <w:sz w:val="20"/>
               </w:rPr>
               <w:t>identificacion</w:t>
             </w:r>
@@ -3640,7 +1645,7 @@
         </w:tc>
         <w:tc>
           <w:tcPr>
-            <w:tcW w:type="dxa" w:w="2835"/>
+            <w:tcW w:type="dxa" w:w="3402"/>
           </w:tcPr>
           <w:p>
             <w:pPr>
@@ -3649,15 +1654,17 @@
             <w:r/>
             <w:r>
               <w:rPr>
-                <w:sz w:val="19"/>
+                <w:sz w:val="20"/>
               </w:rPr>
-              <w:t>PERSONA(identificacion)</w:t>
+              <w:t>persona (identificacion)</w:t>
             </w:r>
           </w:p>
         </w:tc>
+      </w:tr>
+      <w:tr>
         <w:tc>
           <w:tcPr>
-            <w:tcW w:type="dxa" w:w="2268"/>
+            <w:tcW w:type="dxa" w:w="2608"/>
           </w:tcPr>
           <w:p>
             <w:pPr>
@@ -3666,17 +1673,15 @@
             <w:r/>
             <w:r>
               <w:rPr>
-                <w:sz w:val="19"/>
+                <w:sz w:val="20"/>
               </w:rPr>
-              <w:t>El dueño del teléfono</w:t>
+              <w:t>agente</w:t>
             </w:r>
           </w:p>
         </w:tc>
-      </w:tr>
-      <w:tr>
         <w:tc>
           <w:tcPr>
-            <w:tcW w:type="dxa" w:w="1928"/>
+            <w:tcW w:type="dxa" w:w="3175"/>
           </w:tcPr>
           <w:p>
             <w:pPr>
@@ -3685,15 +1690,15 @@
             <w:r/>
             <w:r>
               <w:rPr>
-                <w:sz w:val="19"/>
+                <w:sz w:val="20"/>
               </w:rPr>
-              <w:t>CLIENTE</w:t>
+              <w:t>identificacion</w:t>
             </w:r>
           </w:p>
         </w:tc>
         <w:tc>
           <w:tcPr>
-            <w:tcW w:type="dxa" w:w="2268"/>
+            <w:tcW w:type="dxa" w:w="3402"/>
           </w:tcPr>
           <w:p>
             <w:pPr>
@@ -3702,15 +1707,17 @@
             <w:r/>
             <w:r>
               <w:rPr>
-                <w:sz w:val="19"/>
+                <w:sz w:val="20"/>
               </w:rPr>
-              <w:t>identificacion</w:t>
+              <w:t>persona (identificacion)</w:t>
             </w:r>
           </w:p>
         </w:tc>
+      </w:tr>
+      <w:tr>
         <w:tc>
           <w:tcPr>
-            <w:tcW w:type="dxa" w:w="2835"/>
+            <w:tcW w:type="dxa" w:w="2608"/>
           </w:tcPr>
           <w:p>
             <w:pPr>
@@ -3719,15 +1726,15 @@
             <w:r/>
             <w:r>
               <w:rPr>
-                <w:sz w:val="19"/>
+                <w:sz w:val="20"/>
               </w:rPr>
-              <w:t>PERSONA(identificacion)</w:t>
+              <w:t>administrador</w:t>
             </w:r>
           </w:p>
         </w:tc>
         <w:tc>
           <w:tcPr>
-            <w:tcW w:type="dxa" w:w="2268"/>
+            <w:tcW w:type="dxa" w:w="3175"/>
           </w:tcPr>
           <w:p>
             <w:pPr>
@@ -3736,17 +1743,15 @@
             <w:r/>
             <w:r>
               <w:rPr>
-                <w:sz w:val="19"/>
+                <w:sz w:val="20"/>
               </w:rPr>
-              <w:t>La persona que es cliente</w:t>
+              <w:t>identificacion</w:t>
             </w:r>
           </w:p>
         </w:tc>
-      </w:tr>
-      <w:tr>
         <w:tc>
           <w:tcPr>
-            <w:tcW w:type="dxa" w:w="1928"/>
+            <w:tcW w:type="dxa" w:w="3402"/>
           </w:tcPr>
           <w:p>
             <w:pPr>
@@ -3755,15 +1760,17 @@
             <w:r/>
             <w:r>
               <w:rPr>
-                <w:sz w:val="19"/>
+                <w:sz w:val="20"/>
               </w:rPr>
-              <w:t>AGENTE</w:t>
+              <w:t>persona (identificacion)</w:t>
             </w:r>
           </w:p>
         </w:tc>
+      </w:tr>
+      <w:tr>
         <w:tc>
           <w:tcPr>
-            <w:tcW w:type="dxa" w:w="2268"/>
+            <w:tcW w:type="dxa" w:w="2608"/>
           </w:tcPr>
           <w:p>
             <w:pPr>
@@ -3772,15 +1779,15 @@
             <w:r/>
             <w:r>
               <w:rPr>
-                <w:sz w:val="19"/>
+                <w:sz w:val="20"/>
               </w:rPr>
-              <w:t>identificacion</w:t>
+              <w:t>evento</w:t>
             </w:r>
           </w:p>
         </w:tc>
         <w:tc>
           <w:tcPr>
-            <w:tcW w:type="dxa" w:w="2835"/>
+            <w:tcW w:type="dxa" w:w="3175"/>
           </w:tcPr>
           <w:p>
             <w:pPr>
@@ -3789,15 +1796,15 @@
             <w:r/>
             <w:r>
               <w:rPr>
-                <w:sz w:val="19"/>
+                <w:sz w:val="20"/>
               </w:rPr>
-              <w:t>PERSONA(identificacion)</w:t>
+              <w:t>id_ciudad</w:t>
             </w:r>
           </w:p>
         </w:tc>
         <w:tc>
           <w:tcPr>
-            <w:tcW w:type="dxa" w:w="2268"/>
+            <w:tcW w:type="dxa" w:w="3402"/>
           </w:tcPr>
           <w:p>
             <w:pPr>
@@ -3806,9 +1813,9 @@
             <w:r/>
             <w:r>
               <w:rPr>
-                <w:sz w:val="19"/>
+                <w:sz w:val="20"/>
               </w:rPr>
-              <w:t>La persona que es agente</w:t>
+              <w:t>ciudad (id_ciudad)</w:t>
             </w:r>
           </w:p>
         </w:tc>
@@ -3816,7 +1823,7 @@
       <w:tr>
         <w:tc>
           <w:tcPr>
-            <w:tcW w:type="dxa" w:w="1928"/>
+            <w:tcW w:type="dxa" w:w="2608"/>
           </w:tcPr>
           <w:p>
             <w:pPr>
@@ -3825,15 +1832,15 @@
             <w:r/>
             <w:r>
               <w:rPr>
-                <w:sz w:val="19"/>
+                <w:sz w:val="20"/>
               </w:rPr>
-              <w:t>ADMINISTRADOR</w:t>
+              <w:t>evento</w:t>
             </w:r>
           </w:p>
         </w:tc>
         <w:tc>
           <w:tcPr>
-            <w:tcW w:type="dxa" w:w="2268"/>
+            <w:tcW w:type="dxa" w:w="3175"/>
           </w:tcPr>
           <w:p>
             <w:pPr>
@@ -3842,15 +1849,15 @@
             <w:r/>
             <w:r>
               <w:rPr>
-                <w:sz w:val="19"/>
+                <w:sz w:val="20"/>
               </w:rPr>
-              <w:t>identificacion</w:t>
+              <w:t>identificacion_agente</w:t>
             </w:r>
           </w:p>
         </w:tc>
         <w:tc>
           <w:tcPr>
-            <w:tcW w:type="dxa" w:w="2835"/>
+            <w:tcW w:type="dxa" w:w="3402"/>
           </w:tcPr>
           <w:p>
             <w:pPr>
@@ -3859,15 +1866,17 @@
             <w:r/>
             <w:r>
               <w:rPr>
-                <w:sz w:val="19"/>
+                <w:sz w:val="20"/>
               </w:rPr>
-              <w:t>PERSONA(identificacion)</w:t>
+              <w:t>agente (identificacion)</w:t>
             </w:r>
           </w:p>
         </w:tc>
+      </w:tr>
+      <w:tr>
         <w:tc>
           <w:tcPr>
-            <w:tcW w:type="dxa" w:w="2268"/>
+            <w:tcW w:type="dxa" w:w="2608"/>
           </w:tcPr>
           <w:p>
             <w:pPr>
@@ -3876,17 +1885,15 @@
             <w:r/>
             <w:r>
               <w:rPr>
-                <w:sz w:val="19"/>
+                <w:sz w:val="20"/>
               </w:rPr>
-              <w:t>La persona que es administrador</w:t>
+              <w:t>reserva</w:t>
             </w:r>
           </w:p>
         </w:tc>
-      </w:tr>
-      <w:tr>
         <w:tc>
           <w:tcPr>
-            <w:tcW w:type="dxa" w:w="1928"/>
+            <w:tcW w:type="dxa" w:w="3175"/>
           </w:tcPr>
           <w:p>
             <w:pPr>
@@ -3895,15 +1902,15 @@
             <w:r/>
             <w:r>
               <w:rPr>
-                <w:sz w:val="19"/>
+                <w:sz w:val="20"/>
               </w:rPr>
-              <w:t>EVENTO</w:t>
+              <w:t>identificacion_cliente</w:t>
             </w:r>
           </w:p>
         </w:tc>
         <w:tc>
           <w:tcPr>
-            <w:tcW w:type="dxa" w:w="2268"/>
+            <w:tcW w:type="dxa" w:w="3402"/>
           </w:tcPr>
           <w:p>
             <w:pPr>
@@ -3912,15 +1919,17 @@
             <w:r/>
             <w:r>
               <w:rPr>
-                <w:sz w:val="19"/>
+                <w:sz w:val="20"/>
               </w:rPr>
-              <w:t>id_ciudad</w:t>
+              <w:t>cliente (identificacion)</w:t>
             </w:r>
           </w:p>
         </w:tc>
+      </w:tr>
+      <w:tr>
         <w:tc>
           <w:tcPr>
-            <w:tcW w:type="dxa" w:w="2835"/>
+            <w:tcW w:type="dxa" w:w="2608"/>
           </w:tcPr>
           <w:p>
             <w:pPr>
@@ -3929,15 +1938,15 @@
             <w:r/>
             <w:r>
               <w:rPr>
-                <w:sz w:val="19"/>
+                <w:sz w:val="20"/>
               </w:rPr>
-              <w:t>CIUDAD(id_ciudad)</w:t>
+              <w:t>reserva</w:t>
             </w:r>
           </w:p>
         </w:tc>
         <w:tc>
           <w:tcPr>
-            <w:tcW w:type="dxa" w:w="2268"/>
+            <w:tcW w:type="dxa" w:w="3175"/>
           </w:tcPr>
           <w:p>
             <w:pPr>
@@ -3946,17 +1955,15 @@
             <w:r/>
             <w:r>
               <w:rPr>
-                <w:sz w:val="19"/>
+                <w:sz w:val="20"/>
               </w:rPr>
-              <w:t>La ciudad donde se realiza</w:t>
+              <w:t>codigo_evento</w:t>
             </w:r>
           </w:p>
         </w:tc>
-      </w:tr>
-      <w:tr>
         <w:tc>
           <w:tcPr>
-            <w:tcW w:type="dxa" w:w="1928"/>
+            <w:tcW w:type="dxa" w:w="3402"/>
           </w:tcPr>
           <w:p>
             <w:pPr>
@@ -3965,200 +1972,9 @@
             <w:r/>
             <w:r>
               <w:rPr>
-                <w:sz w:val="19"/>
+                <w:sz w:val="20"/>
               </w:rPr>
-              <w:t>EVENTO</w:t>
-            </w:r>
-          </w:p>
-        </w:tc>
-        <w:tc>
-          <w:tcPr>
-            <w:tcW w:type="dxa" w:w="2268"/>
-          </w:tcPr>
-          <w:p>
-            <w:pPr>
-              <w:spacing w:after="20"/>
-            </w:pPr>
-            <w:r/>
-            <w:r>
-              <w:rPr>
-                <w:sz w:val="19"/>
-              </w:rPr>
-              <w:t>identificacion_agente</w:t>
-            </w:r>
-          </w:p>
-        </w:tc>
-        <w:tc>
-          <w:tcPr>
-            <w:tcW w:type="dxa" w:w="2835"/>
-          </w:tcPr>
-          <w:p>
-            <w:pPr>
-              <w:spacing w:after="20"/>
-            </w:pPr>
-            <w:r/>
-            <w:r>
-              <w:rPr>
-                <w:sz w:val="19"/>
-              </w:rPr>
-              <w:t>AGENTE(identificacion)</w:t>
-            </w:r>
-          </w:p>
-        </w:tc>
-        <w:tc>
-          <w:tcPr>
-            <w:tcW w:type="dxa" w:w="2268"/>
-          </w:tcPr>
-          <w:p>
-            <w:pPr>
-              <w:spacing w:after="20"/>
-            </w:pPr>
-            <w:r/>
-            <w:r>
-              <w:rPr>
-                <w:sz w:val="19"/>
-              </w:rPr>
-              <w:t>El agente que lo registró</w:t>
-            </w:r>
-          </w:p>
-        </w:tc>
-      </w:tr>
-      <w:tr>
-        <w:tc>
-          <w:tcPr>
-            <w:tcW w:type="dxa" w:w="1928"/>
-          </w:tcPr>
-          <w:p>
-            <w:pPr>
-              <w:spacing w:after="20"/>
-            </w:pPr>
-            <w:r/>
-            <w:r>
-              <w:rPr>
-                <w:sz w:val="19"/>
-              </w:rPr>
-              <w:t>RESERVA</w:t>
-            </w:r>
-          </w:p>
-        </w:tc>
-        <w:tc>
-          <w:tcPr>
-            <w:tcW w:type="dxa" w:w="2268"/>
-          </w:tcPr>
-          <w:p>
-            <w:pPr>
-              <w:spacing w:after="20"/>
-            </w:pPr>
-            <w:r/>
-            <w:r>
-              <w:rPr>
-                <w:sz w:val="19"/>
-              </w:rPr>
-              <w:t>identificacion_cliente</w:t>
-            </w:r>
-          </w:p>
-        </w:tc>
-        <w:tc>
-          <w:tcPr>
-            <w:tcW w:type="dxa" w:w="2835"/>
-          </w:tcPr>
-          <w:p>
-            <w:pPr>
-              <w:spacing w:after="20"/>
-            </w:pPr>
-            <w:r/>
-            <w:r>
-              <w:rPr>
-                <w:sz w:val="19"/>
-              </w:rPr>
-              <w:t>CLIENTE(identificacion)</w:t>
-            </w:r>
-          </w:p>
-        </w:tc>
-        <w:tc>
-          <w:tcPr>
-            <w:tcW w:type="dxa" w:w="2268"/>
-          </w:tcPr>
-          <w:p>
-            <w:pPr>
-              <w:spacing w:after="20"/>
-            </w:pPr>
-            <w:r/>
-            <w:r>
-              <w:rPr>
-                <w:sz w:val="19"/>
-              </w:rPr>
-              <w:t>El cliente que reserva</w:t>
-            </w:r>
-          </w:p>
-        </w:tc>
-      </w:tr>
-      <w:tr>
-        <w:tc>
-          <w:tcPr>
-            <w:tcW w:type="dxa" w:w="1928"/>
-          </w:tcPr>
-          <w:p>
-            <w:pPr>
-              <w:spacing w:after="20"/>
-            </w:pPr>
-            <w:r/>
-            <w:r>
-              <w:rPr>
-                <w:sz w:val="19"/>
-              </w:rPr>
-              <w:t>RESERVA</w:t>
-            </w:r>
-          </w:p>
-        </w:tc>
-        <w:tc>
-          <w:tcPr>
-            <w:tcW w:type="dxa" w:w="2268"/>
-          </w:tcPr>
-          <w:p>
-            <w:pPr>
-              <w:spacing w:after="20"/>
-            </w:pPr>
-            <w:r/>
-            <w:r>
-              <w:rPr>
-                <w:sz w:val="19"/>
-              </w:rPr>
-              <w:t>codigo_evento</w:t>
-            </w:r>
-          </w:p>
-        </w:tc>
-        <w:tc>
-          <w:tcPr>
-            <w:tcW w:type="dxa" w:w="2835"/>
-          </w:tcPr>
-          <w:p>
-            <w:pPr>
-              <w:spacing w:after="20"/>
-            </w:pPr>
-            <w:r/>
-            <w:r>
-              <w:rPr>
-                <w:sz w:val="19"/>
-              </w:rPr>
-              <w:t>EVENTO(codigo_evento)</w:t>
-            </w:r>
-          </w:p>
-        </w:tc>
-        <w:tc>
-          <w:tcPr>
-            <w:tcW w:type="dxa" w:w="2268"/>
-          </w:tcPr>
-          <w:p>
-            <w:pPr>
-              <w:spacing w:after="20"/>
-            </w:pPr>
-            <w:r/>
-            <w:r>
-              <w:rPr>
-                <w:sz w:val="19"/>
-              </w:rPr>
-              <w:t>El evento reservado</w:t>
+              <w:t>evento (codigo_evento)</w:t>
             </w:r>
           </w:p>
         </w:tc>
@@ -4166,339 +1982,20 @@
     </w:tbl>
     <w:p>
       <w:pPr>
-        <w:pStyle w:val="Heading2"/>
+        <w:spacing w:before="200"/>
       </w:pPr>
-      <w:r>
-        <w:t>Restricciones de integridad</w:t>
-      </w:r>
-    </w:p>
-    <w:p>
-      <w:pPr>
-        <w:pStyle w:val="ListBullet"/>
-        <w:spacing w:after="60"/>
-      </w:pPr>
-      <w:r>
-        <w:rPr>
-          <w:b/>
-        </w:rPr>
-        <w:t xml:space="preserve">Integridad de entidad: </w:t>
-      </w:r>
-      <w:r>
-        <w:t>ninguna llave primaria admite nulos, y no hay dos filas con la misma llave.</w:t>
-      </w:r>
-    </w:p>
-    <w:p>
-      <w:pPr>
-        <w:pStyle w:val="ListBullet"/>
-        <w:spacing w:after="60"/>
-      </w:pPr>
-      <w:r>
-        <w:rPr>
-          <w:b/>
-        </w:rPr>
-        <w:t xml:space="preserve">Integridad referencial: </w:t>
-      </w:r>
-      <w:r>
-        <w:t>toda llave foránea debe existir en la tabla a la que apunta. Un teléfono sin persona o una reserva sin evento no se pueden guardar.</w:t>
-      </w:r>
-    </w:p>
-    <w:p>
-      <w:pPr>
-        <w:pStyle w:val="ListBullet"/>
-        <w:spacing w:after="60"/>
-      </w:pPr>
-      <w:r>
-        <w:rPr>
-          <w:b/>
-        </w:rPr>
-        <w:t xml:space="preserve">Dominio: </w:t>
-      </w:r>
-      <w:r>
-        <w:t>estado de EVENTO solo acepta Programado, En Boletería, En Vivo, Finalizado o Cancelado; estado de RESERVA solo Reservada, Confirmada o Cancelada.</w:t>
-      </w:r>
-    </w:p>
-    <w:p>
-      <w:pPr>
-        <w:pStyle w:val="ListBullet"/>
-        <w:spacing w:after="60"/>
-      </w:pPr>
-      <w:r>
-        <w:rPr>
-          <w:b/>
-        </w:rPr>
-        <w:t xml:space="preserve">Unicidad: </w:t>
-      </w:r>
-      <w:r>
-        <w:t>el correo de PERSONA no se puede repetir.</w:t>
-      </w:r>
-    </w:p>
-    <w:p>
-      <w:pPr>
-        <w:pStyle w:val="ListBullet"/>
-        <w:spacing w:after="60"/>
-      </w:pPr>
-      <w:r>
-        <w:rPr>
-          <w:b/>
-        </w:rPr>
-        <w:t xml:space="preserve">Valores válidos: </w:t>
-      </w:r>
-      <w:r>
-        <w:t>capacidad_total y numero_entradas deben ser mayores que cero, precio_base no puede ser negativo y la fecha de fin debe ser posterior a la de inicio.</w:t>
-      </w:r>
-    </w:p>
-    <w:p>
-      <w:pPr>
-        <w:pStyle w:val="ListBullet"/>
-        <w:spacing w:after="60"/>
-      </w:pPr>
-      <w:r>
-        <w:rPr>
-          <w:b/>
-        </w:rPr>
-        <w:t xml:space="preserve">Regla del negocio: </w:t>
-      </w:r>
-      <w:r>
-        <w:t>las entradas reservadas y confirmadas de un evento no pueden superar su capacidad_total. Esta se revisa en el momento de confirmar la reserva.</w:t>
-      </w:r>
-    </w:p>
-    <w:p>
-      <w:r>
-        <w:br w:type="page"/>
-      </w:r>
-    </w:p>
-    <w:p>
-      <w:pPr>
-        <w:pStyle w:val="Heading1"/>
-      </w:pPr>
-      <w:r>
-        <w:t>4. Anexo: el esquema en PostgreSQL</w:t>
-      </w:r>
-    </w:p>
-    <w:p>
       <w:r>
         <w:rPr>
           <w:b w:val="0"/>
           <w:i w:val="0"/>
         </w:rPr>
-        <w:t>Traducción directa del esquema anterior al lenguaje de definición de datos, que es lo que se implementará en el Sprint 2.</w:t>
-      </w:r>
-    </w:p>
-    <w:p>
-      <w:pPr>
-        <w:spacing w:after="200"/>
-        <w:ind w:left="227"/>
-      </w:pPr>
-      <w:r>
-        <w:rPr>
-          <w:rFonts w:ascii="Consolas" w:hAnsi="Consolas" w:eastAsia="Consolas"/>
-          <w:sz w:val="18"/>
-        </w:rPr>
-        <w:t>CREATE TABLE pais (</w:t>
-        <w:br/>
-        <w:t xml:space="preserve">    id_pais        SERIAL PRIMARY KEY,</w:t>
-        <w:br/>
-        <w:t xml:space="preserve">    nombre         VARCHAR(60) NOT NULL</w:t>
-        <w:br/>
-        <w:t>);</w:t>
-        <w:br/>
-        <w:br/>
-        <w:t>CREATE TABLE departamento (</w:t>
-        <w:br/>
-        <w:t xml:space="preserve">    id_departamento SERIAL PRIMARY KEY,</w:t>
-        <w:br/>
-        <w:t xml:space="preserve">    nombre          VARCHAR(60) NOT NULL,</w:t>
-        <w:br/>
-        <w:t xml:space="preserve">    id_pais         INTEGER NOT NULL REFERENCES pais(id_pais)</w:t>
-        <w:br/>
-        <w:t>);</w:t>
-        <w:br/>
-        <w:br/>
-        <w:t>CREATE TABLE ciudad (</w:t>
-        <w:br/>
-        <w:t xml:space="preserve">    id_ciudad       SERIAL PRIMARY KEY,</w:t>
-        <w:br/>
-        <w:t xml:space="preserve">    nombre          VARCHAR(60) NOT NULL,</w:t>
-        <w:br/>
-        <w:t xml:space="preserve">    id_departamento INTEGER NOT NULL REFERENCES departamento(id_departamento)</w:t>
-        <w:br/>
-        <w:t>);</w:t>
-        <w:br/>
-        <w:br/>
-        <w:t>CREATE TABLE persona (</w:t>
-        <w:br/>
-        <w:t xml:space="preserve">    identificacion  VARCHAR(20) PRIMARY KEY,</w:t>
-        <w:br/>
-        <w:t xml:space="preserve">    nombres         VARCHAR(60) NOT NULL,</w:t>
-        <w:br/>
-        <w:t xml:space="preserve">    apellidos       VARCHAR(60) NOT NULL,</w:t>
-        <w:br/>
-        <w:t xml:space="preserve">    correo          VARCHAR(120) NOT NULL UNIQUE,</w:t>
-        <w:br/>
-        <w:t xml:space="preserve">    direccion       VARCHAR(120),</w:t>
-        <w:br/>
-        <w:t xml:space="preserve">    id_ciudad       INTEGER NOT NULL REFERENCES ciudad(id_ciudad)</w:t>
-        <w:br/>
-        <w:t>);</w:t>
-        <w:br/>
-        <w:br/>
-        <w:t>CREATE TABLE telefono (</w:t>
-        <w:br/>
-        <w:t xml:space="preserve">    identificacion  VARCHAR(20) REFERENCES persona(identificacion),</w:t>
-        <w:br/>
-        <w:t xml:space="preserve">    numero          VARCHAR(20),</w:t>
-        <w:br/>
-        <w:t xml:space="preserve">    PRIMARY KEY (identificacion, numero)</w:t>
-        <w:br/>
-        <w:t>);</w:t>
-        <w:br/>
-        <w:br/>
-        <w:t>CREATE TABLE cliente (</w:t>
-        <w:br/>
-        <w:t xml:space="preserve">    identificacion  VARCHAR(20) PRIMARY KEY REFERENCES persona(identificacion),</w:t>
-        <w:br/>
-        <w:t xml:space="preserve">    puntos          INTEGER NOT NULL DEFAULT 0,</w:t>
-        <w:br/>
-        <w:t xml:space="preserve">    ve_publicidad   BOOLEAN NOT NULL DEFAULT TRUE</w:t>
-        <w:br/>
-        <w:t>);</w:t>
-        <w:br/>
-        <w:br/>
-        <w:t>CREATE TABLE agente (</w:t>
-        <w:br/>
-        <w:t xml:space="preserve">    identificacion  VARCHAR(20) PRIMARY KEY REFERENCES persona(identificacion),</w:t>
-        <w:br/>
-        <w:t xml:space="preserve">    comision        NUMERIC(5,2) NOT NULL DEFAULT 0,</w:t>
-        <w:br/>
-        <w:t xml:space="preserve">    experiencia     INTEGER NOT NULL DEFAULT 0</w:t>
-        <w:br/>
-        <w:t>);</w:t>
-        <w:br/>
-        <w:br/>
-        <w:t>CREATE TABLE administrador (</w:t>
-        <w:br/>
-        <w:t xml:space="preserve">    identificacion  VARCHAR(20) PRIMARY KEY REFERENCES persona(identificacion),</w:t>
-        <w:br/>
-        <w:t xml:space="preserve">    salario         NUMERIC(12,2) NOT NULL,</w:t>
-        <w:br/>
-        <w:t xml:space="preserve">    horario         VARCHAR(60)</w:t>
-        <w:br/>
-        <w:t>);</w:t>
-        <w:br/>
-        <w:br/>
-        <w:t>CREATE TABLE evento (</w:t>
-        <w:br/>
-        <w:t xml:space="preserve">    codigo_evento     VARCHAR(20) PRIMARY KEY,</w:t>
-        <w:br/>
-        <w:t xml:space="preserve">    nombre            VARCHAR(120) NOT NULL,</w:t>
-        <w:br/>
-        <w:t xml:space="preserve">    descripcion       TEXT,</w:t>
-        <w:br/>
-        <w:t xml:space="preserve">    teatro            VARCHAR(120),</w:t>
-        <w:br/>
-        <w:t xml:space="preserve">    fecha_hora_inicio TIMESTAMP NOT NULL,</w:t>
-        <w:br/>
-        <w:t xml:space="preserve">    fecha_hora_fin    TIMESTAMP,</w:t>
-        <w:br/>
-        <w:t xml:space="preserve">    capacidad_total   INTEGER NOT NULL CHECK (capacidad_total &gt; 0),</w:t>
-        <w:br/>
-        <w:t xml:space="preserve">    precio_base       NUMERIC(12,2) NOT NULL CHECK (precio_base &gt;= 0),</w:t>
-        <w:br/>
-        <w:t xml:space="preserve">    observaciones     TEXT,</w:t>
-        <w:br/>
-        <w:t xml:space="preserve">    estado            VARCHAR(20) NOT NULL</w:t>
-        <w:br/>
-        <w:t xml:space="preserve">                      CHECK (estado IN ('Programado','En Boleteria','En Vivo',</w:t>
-        <w:br/>
-        <w:t xml:space="preserve">                                        'Finalizado','Cancelado')),</w:t>
-        <w:br/>
-        <w:t xml:space="preserve">    id_ciudad         INTEGER NOT NULL REFERENCES ciudad(id_ciudad),</w:t>
-        <w:br/>
-        <w:t xml:space="preserve">    identificacion_agente VARCHAR(20) NOT NULL REFERENCES agente(identificacion),</w:t>
-        <w:br/>
-        <w:t xml:space="preserve">    CHECK (fecha_hora_fin IS NULL OR fecha_hora_fin &gt; fecha_hora_inicio)</w:t>
-        <w:br/>
-        <w:t>);</w:t>
-        <w:br/>
-        <w:br/>
-        <w:t>CREATE TABLE reserva (</w:t>
-        <w:br/>
-        <w:t xml:space="preserve">    id_reserva      SERIAL PRIMARY KEY,</w:t>
-        <w:br/>
-        <w:t xml:space="preserve">    fecha_hora      TIMESTAMP NOT NULL DEFAULT NOW(),</w:t>
-        <w:br/>
-        <w:t xml:space="preserve">    numero_entradas INTEGER NOT NULL CHECK (numero_entradas &gt; 0),</w:t>
-        <w:br/>
-        <w:t xml:space="preserve">    observaciones   TEXT,</w:t>
-        <w:br/>
-        <w:t xml:space="preserve">    estado          VARCHAR(20) NOT NULL</w:t>
-        <w:br/>
-        <w:t xml:space="preserve">                    CHECK (estado IN ('Reservada','Confirmada','Cancelada')),</w:t>
-        <w:br/>
-        <w:t xml:space="preserve">    identificacion_cliente VARCHAR(20) NOT NULL REFERENCES cliente(identificacion),</w:t>
-        <w:br/>
-        <w:t xml:space="preserve">    codigo_evento   VARCHAR(20) NOT NULL REFERENCES evento(codigo_evento)</w:t>
-        <w:br/>
-        <w:t>);</w:t>
-      </w:r>
-    </w:p>
-    <w:p>
-      <w:pPr>
-        <w:pStyle w:val="Heading2"/>
-      </w:pPr>
-      <w:r>
-        <w:t>Los atributos derivados</w:t>
-      </w:r>
-    </w:p>
-    <w:p>
-      <w:r>
-        <w:rPr>
-          <w:b w:val="0"/>
-          <w:i w:val="0"/>
-        </w:rPr>
-        <w:t>No son columnas: se calculan con una consulta, para que nunca queden desactualizados.</w:t>
-      </w:r>
-    </w:p>
-    <w:p>
-      <w:pPr>
-        <w:spacing w:after="200"/>
-        <w:ind w:left="227"/>
-      </w:pPr>
-      <w:r>
-        <w:rPr>
-          <w:rFonts w:ascii="Consolas" w:hAnsi="Consolas" w:eastAsia="Consolas"/>
-          <w:sz w:val="18"/>
-        </w:rPr>
-        <w:t>-- Cupos disponibles de un evento</w:t>
-        <w:br/>
-        <w:t>SELECT e.capacidad_total - COALESCE(SUM(r.numero_entradas), 0) AS cupos_disponibles</w:t>
-        <w:br/>
-        <w:t>FROM   evento e</w:t>
-        <w:br/>
-        <w:t>LEFT   JOIN reserva r ON r.codigo_evento = e.codigo_evento</w:t>
-        <w:br/>
-        <w:t xml:space="preserve">       AND r.estado IN ('Reservada','Confirmada')</w:t>
-        <w:br/>
-        <w:t>WHERE  e.codigo_evento = 'EV-001'</w:t>
-        <w:br/>
-        <w:t>GROUP  BY e.capacidad_total;</w:t>
-        <w:br/>
-        <w:br/>
-        <w:t>-- Valor total de una reserva</w:t>
-        <w:br/>
-        <w:t>SELECT r.numero_entradas * e.precio_base AS valor_total</w:t>
-        <w:br/>
-        <w:t>FROM   reserva r</w:t>
-        <w:br/>
-        <w:t>JOIN   evento e ON e.codigo_evento = r.codigo_evento</w:t>
-        <w:br/>
-        <w:t>WHERE  r.id_reserva = 1;</w:t>
+        <w:t>Hay dos datos que no pusimos como columnas: los cupos disponibles de un evento y el valor total de una reserva. Los dos se pueden calcular, el primero restándole a la capacidad las entradas ya reservadas, y el segundo multiplicando el número de entradas por el precio del evento. Si los guardáramos, podrían quedar desactualizados.</w:t>
       </w:r>
     </w:p>
     <w:sectPr>
-      <w:footerReference w:type="default" r:id="rId10"/>
+      <w:footerReference w:type="default" r:id="rId11"/>
       <w:pgSz w:w="12240" w:h="15840"/>
-      <w:pgMar w:top="1247" w:right="1304" w:bottom="1247" w:left="1304" w:header="720" w:footer="720" w:gutter="0"/>
+      <w:pgMar w:top="1304" w:right="1361" w:bottom="1304" w:left="1361" w:header="720" w:footer="720" w:gutter="0"/>
       <w:cols w:space="720"/>
       <w:docGrid w:linePitch="360"/>
     </w:sectPr>
@@ -4890,7 +2387,7 @@
     <w:qFormat/>
     <w:rsid w:val="00FC693F"/>
     <w:pPr>
-      <w:spacing w:after="120" w:line="288" w:lineRule="auto"/>
+      <w:spacing w:after="160" w:line="312" w:lineRule="auto"/>
     </w:pPr>
     <w:rPr>
       <w:rFonts w:ascii="Calibri" w:hAnsi="Calibri" w:eastAsia="Calibri"/>
@@ -4953,15 +2450,15 @@
     <w:pPr>
       <w:keepNext/>
       <w:keepLines/>
-      <w:spacing w:before="300" w:after="120"/>
+      <w:spacing w:before="280" w:after="120"/>
       <w:outlineLvl w:val="0"/>
     </w:pPr>
     <w:rPr>
-      <w:rFonts w:asciiTheme="majorHAnsi" w:eastAsiaTheme="majorEastAsia" w:hAnsiTheme="majorHAnsi" w:cstheme="majorBidi" w:ascii="Cambria" w:hAnsi="Cambria"/>
+      <w:rFonts w:asciiTheme="majorHAnsi" w:eastAsiaTheme="majorEastAsia" w:hAnsiTheme="majorHAnsi" w:cstheme="majorBidi" w:ascii="Calibri" w:hAnsi="Calibri"/>
       <w:b/>
       <w:bCs/>
       <w:color w:val="191C1E"/>
-      <w:sz w:val="32"/>
+      <w:sz w:val="30"/>
       <w:szCs w:val="28"/>
     </w:rPr>
   </w:style>
@@ -4977,15 +2474,15 @@
     <w:pPr>
       <w:keepNext/>
       <w:keepLines/>
-      <w:spacing w:before="200" w:after="120"/>
+      <w:spacing w:before="280" w:after="120"/>
       <w:outlineLvl w:val="1"/>
     </w:pPr>
     <w:rPr>
-      <w:rFonts w:asciiTheme="majorHAnsi" w:eastAsiaTheme="majorEastAsia" w:hAnsiTheme="majorHAnsi" w:cstheme="majorBidi" w:ascii="Cambria" w:hAnsi="Cambria"/>
+      <w:rFonts w:asciiTheme="majorHAnsi" w:eastAsiaTheme="majorEastAsia" w:hAnsiTheme="majorHAnsi" w:cstheme="majorBidi" w:ascii="Calibri" w:hAnsi="Calibri"/>
       <w:b/>
       <w:bCs/>
       <w:color w:val="493EE5"/>
-      <w:sz w:val="26"/>
+      <w:sz w:val="25"/>
       <w:szCs w:val="26"/>
     </w:rPr>
   </w:style>

</xml_diff>

<commit_message>
Portada del modelo relacional con los cinco integrantes y sus codigos
</commit_message>
<xml_diff>
--- a/database/Modelo_Relacional_TicketFlow.docx
+++ b/database/Modelo_Relacional_TicketFlow.docx
@@ -76,7 +76,49 @@
           <w:i w:val="0"/>
           <w:sz w:val="23"/>
         </w:rPr>
-        <w:t>Eder Fabián Rodríguez Murillo</w:t>
+        <w:t>Eder Fabián Rodríguez Murillo · 230251029</w:t>
+      </w:r>
+    </w:p>
+    <w:p>
+      <w:pPr>
+        <w:spacing w:after="40"/>
+        <w:jc w:val="center"/>
+      </w:pPr>
+      <w:r>
+        <w:rPr>
+          <w:b w:val="0"/>
+          <w:i w:val="0"/>
+          <w:sz w:val="23"/>
+        </w:rPr>
+        <w:t>Alex Andrés Cruz Rueda · 230251088</w:t>
+      </w:r>
+    </w:p>
+    <w:p>
+      <w:pPr>
+        <w:spacing w:after="40"/>
+        <w:jc w:val="center"/>
+      </w:pPr>
+      <w:r>
+        <w:rPr>
+          <w:b w:val="0"/>
+          <w:i w:val="0"/>
+          <w:sz w:val="23"/>
+        </w:rPr>
+        <w:t>Jorge Andrés Marín Díaz · 230251073</w:t>
+      </w:r>
+    </w:p>
+    <w:p>
+      <w:pPr>
+        <w:spacing w:after="40"/>
+        <w:jc w:val="center"/>
+      </w:pPr>
+      <w:r>
+        <w:rPr>
+          <w:b w:val="0"/>
+          <w:i w:val="0"/>
+          <w:sz w:val="23"/>
+        </w:rPr>
+        <w:t>Samuel Uribe Naranjo · 230251048</w:t>
       </w:r>
     </w:p>
     <w:p>
@@ -91,34 +133,6 @@
           <w:sz w:val="23"/>
         </w:rPr>
         <w:t>Eduardo José Benítez Guevara</w:t>
-      </w:r>
-    </w:p>
-    <w:p>
-      <w:pPr>
-        <w:spacing w:after="40"/>
-        <w:jc w:val="center"/>
-      </w:pPr>
-      <w:r>
-        <w:rPr>
-          <w:b w:val="0"/>
-          <w:i w:val="0"/>
-          <w:sz w:val="23"/>
-        </w:rPr>
-        <w:t>Jorge Andrés Marín Díaz</w:t>
-      </w:r>
-    </w:p>
-    <w:p>
-      <w:pPr>
-        <w:spacing w:after="40"/>
-        <w:jc w:val="center"/>
-      </w:pPr>
-      <w:r>
-        <w:rPr>
-          <w:b w:val="0"/>
-          <w:i w:val="0"/>
-          <w:sz w:val="23"/>
-        </w:rPr>
-        <w:t>Samuel Uribe Naranjo</w:t>
       </w:r>
     </w:p>
     <w:p>
@@ -146,7 +160,7 @@
           <w:color w:val="5A5868"/>
           <w:sz w:val="22"/>
         </w:rPr>
-        <w:t>Tuluá · Septiembre de 2026</w:t>
+        <w:t>Tuluá · 27 de septiembre de 2026</w:t>
       </w:r>
     </w:p>
     <w:p>

</xml_diff>

<commit_message>
Contrasena y causa de cancelacion en el modelo de datos
El enunciado pide iniciar sesion con correo y contrasena, pero el diagrama
no tenia ese atributo. Tambien pide reportar las reservas y los eventos
cancelados con su causa. Se agregan las tres columnas al diagrama de Chen,
al diagrama relacional y al documento de entrega, con la nota de por que
se agregaron.
</commit_message>
<xml_diff>
--- a/database/Modelo_Relacional_TicketFlow.docx
+++ b/database/Modelo_Relacional_TicketFlow.docx
@@ -663,6 +663,20 @@
           <w:rFonts w:ascii="Consolas" w:hAnsi="Consolas" w:eastAsia="Consolas"/>
           <w:sz w:val="21"/>
         </w:rPr>
+        <w:t>contrasena</w:t>
+      </w:r>
+      <w:r>
+        <w:rPr>
+          <w:rFonts w:ascii="Consolas" w:hAnsi="Consolas" w:eastAsia="Consolas"/>
+          <w:sz w:val="21"/>
+        </w:rPr>
+        <w:t xml:space="preserve">, </w:t>
+      </w:r>
+      <w:r>
+        <w:rPr>
+          <w:rFonts w:ascii="Consolas" w:hAnsi="Consolas" w:eastAsia="Consolas"/>
+          <w:sz w:val="21"/>
+        </w:rPr>
         <w:t>direccion</w:t>
       </w:r>
       <w:r>
@@ -1145,6 +1159,20 @@
       <w:r>
         <w:rPr>
           <w:rFonts w:ascii="Consolas" w:hAnsi="Consolas" w:eastAsia="Consolas"/>
+          <w:sz w:val="21"/>
+        </w:rPr>
+        <w:t>causa_cancelacion</w:t>
+      </w:r>
+      <w:r>
+        <w:rPr>
+          <w:rFonts w:ascii="Consolas" w:hAnsi="Consolas" w:eastAsia="Consolas"/>
+          <w:sz w:val="21"/>
+        </w:rPr>
+        <w:t xml:space="preserve">, </w:t>
+      </w:r>
+      <w:r>
+        <w:rPr>
+          <w:rFonts w:ascii="Consolas" w:hAnsi="Consolas" w:eastAsia="Consolas"/>
           <w:color w:val="493EE5"/>
           <w:sz w:val="21"/>
         </w:rPr>
@@ -1273,6 +1301,20 @@
           <w:sz w:val="21"/>
         </w:rPr>
         <w:t>estado</w:t>
+      </w:r>
+      <w:r>
+        <w:rPr>
+          <w:rFonts w:ascii="Consolas" w:hAnsi="Consolas" w:eastAsia="Consolas"/>
+          <w:sz w:val="21"/>
+        </w:rPr>
+        <w:t xml:space="preserve">, </w:t>
+      </w:r>
+      <w:r>
+        <w:rPr>
+          <w:rFonts w:ascii="Consolas" w:hAnsi="Consolas" w:eastAsia="Consolas"/>
+          <w:sz w:val="21"/>
+        </w:rPr>
+        <w:t>causa_cancelacion</w:t>
       </w:r>
       <w:r>
         <w:rPr>
@@ -2003,6 +2045,18 @@
           <w:b w:val="0"/>
           <w:i w:val="0"/>
         </w:rPr>
+        <w:t>Al pasar el modelo a PostgreSQL agregamos tres columnas que el diagrama inicial no tenía. La contraseña de la persona, porque el enunciado pide iniciar sesión con correo y contraseña y sin ella no se podía; se guarda cifrada, nunca en texto plano. Y la causa de la cancelación en evento y en reserva, porque dos de los reportes que pide el enunciado son justamente las reservas canceladas y su causa, y los eventos cancelados y su causa.</w:t>
+      </w:r>
+    </w:p>
+    <w:p>
+      <w:pPr>
+        <w:spacing w:before="200"/>
+      </w:pPr>
+      <w:r>
+        <w:rPr>
+          <w:b w:val="0"/>
+          <w:i w:val="0"/>
+        </w:rPr>
         <w:t>Hay dos datos que no pusimos como columnas: los cupos disponibles de un evento y el valor total de una reserva. Los dos se pueden calcular, el primero restándole a la capacidad las entradas ya reservadas, y el segundo multiplicando el número de entradas por el precio del evento. Si los guardáramos, podrían quedar desactualizados.</w:t>
       </w:r>
     </w:p>

</xml_diff>